<commit_message>
tạo template và cấu trúc
</commit_message>
<xml_diff>
--- a/Online Bookstore Website/documents/BaoCaoBaitaplon_mau - Copy.docx
+++ b/Online Bookstore Website/documents/BaoCaoBaitaplon_mau - Copy.docx
@@ -277,7 +277,6 @@
             </w:rPr>
             <w:t xml:space="preserve">Website </w:t>
           </w:r>
-          <w:proofErr w:type="spellStart"/>
           <w:r>
             <w:rPr>
               <w:rFonts w:ascii="Times New Roman" w:eastAsiaTheme="minorEastAsia" w:hAnsi="Times New Roman" w:cs="Times New Roman"/>
@@ -294,17 +293,7 @@
               <w:sz w:val="32"/>
               <w:szCs w:val="32"/>
             </w:rPr>
-            <w:t>iới</w:t>
-          </w:r>
-          <w:proofErr w:type="spellEnd"/>
-          <w:r>
-            <w:rPr>
-              <w:rFonts w:ascii="Times New Roman" w:eastAsiaTheme="minorEastAsia" w:hAnsi="Times New Roman" w:cs="Times New Roman"/>
-              <w:color w:val="000000" w:themeColor="text1"/>
-              <w:sz w:val="32"/>
-              <w:szCs w:val="32"/>
-            </w:rPr>
-            <w:t xml:space="preserve"> </w:t>
+            <w:t xml:space="preserve">iới </w:t>
           </w:r>
           <w:r>
             <w:rPr>
@@ -342,7 +331,6 @@
             </w:rPr>
             <w:t xml:space="preserve">án </w:t>
           </w:r>
-          <w:proofErr w:type="spellStart"/>
           <w:r>
             <w:rPr>
               <w:rFonts w:ascii="Times New Roman" w:eastAsiaTheme="minorEastAsia" w:hAnsi="Times New Roman" w:cs="Times New Roman"/>
@@ -359,19 +347,8 @@
               <w:sz w:val="32"/>
               <w:szCs w:val="32"/>
             </w:rPr>
-            <w:t>ách</w:t>
+            <w:t xml:space="preserve">ách </w:t>
           </w:r>
-          <w:proofErr w:type="spellEnd"/>
-          <w:r>
-            <w:rPr>
-              <w:rFonts w:ascii="Times New Roman" w:eastAsiaTheme="minorEastAsia" w:hAnsi="Times New Roman" w:cs="Times New Roman"/>
-              <w:color w:val="000000" w:themeColor="text1"/>
-              <w:sz w:val="32"/>
-              <w:szCs w:val="32"/>
-            </w:rPr>
-            <w:t xml:space="preserve"> </w:t>
-          </w:r>
-          <w:proofErr w:type="spellStart"/>
           <w:r>
             <w:rPr>
               <w:rFonts w:ascii="Times New Roman" w:eastAsiaTheme="minorEastAsia" w:hAnsi="Times New Roman" w:cs="Times New Roman"/>
@@ -388,17 +365,7 @@
               <w:sz w:val="32"/>
               <w:szCs w:val="32"/>
             </w:rPr>
-            <w:t>rực</w:t>
-          </w:r>
-          <w:proofErr w:type="spellEnd"/>
-          <w:r>
-            <w:rPr>
-              <w:rFonts w:ascii="Times New Roman" w:eastAsiaTheme="minorEastAsia" w:hAnsi="Times New Roman" w:cs="Times New Roman"/>
-              <w:color w:val="000000" w:themeColor="text1"/>
-              <w:sz w:val="32"/>
-              <w:szCs w:val="32"/>
-            </w:rPr>
-            <w:t xml:space="preserve"> </w:t>
+            <w:t xml:space="preserve">rực </w:t>
           </w:r>
           <w:r>
             <w:rPr>
@@ -663,52 +630,14 @@
                     <w:szCs w:val="26"/>
                   </w:rPr>
                 </w:pPr>
-                <w:proofErr w:type="spellStart"/>
                 <w:r>
                   <w:rPr>
                     <w:rFonts w:ascii="Times New Roman" w:hAnsi="Times New Roman" w:cs="Times New Roman"/>
                     <w:sz w:val="26"/>
                     <w:szCs w:val="26"/>
                   </w:rPr>
-                  <w:t>Họ</w:t>
+                  <w:t>Họ và tên</w:t>
                 </w:r>
-                <w:proofErr w:type="spellEnd"/>
-                <w:r>
-                  <w:rPr>
-                    <w:rFonts w:ascii="Times New Roman" w:hAnsi="Times New Roman" w:cs="Times New Roman"/>
-                    <w:sz w:val="26"/>
-                    <w:szCs w:val="26"/>
-                  </w:rPr>
-                  <w:t xml:space="preserve"> </w:t>
-                </w:r>
-                <w:proofErr w:type="spellStart"/>
-                <w:r>
-                  <w:rPr>
-                    <w:rFonts w:ascii="Times New Roman" w:hAnsi="Times New Roman" w:cs="Times New Roman"/>
-                    <w:sz w:val="26"/>
-                    <w:szCs w:val="26"/>
-                  </w:rPr>
-                  <w:t>và</w:t>
-                </w:r>
-                <w:proofErr w:type="spellEnd"/>
-                <w:r>
-                  <w:rPr>
-                    <w:rFonts w:ascii="Times New Roman" w:hAnsi="Times New Roman" w:cs="Times New Roman"/>
-                    <w:sz w:val="26"/>
-                    <w:szCs w:val="26"/>
-                  </w:rPr>
-                  <w:t xml:space="preserve"> </w:t>
-                </w:r>
-                <w:proofErr w:type="spellStart"/>
-                <w:r>
-                  <w:rPr>
-                    <w:rFonts w:ascii="Times New Roman" w:hAnsi="Times New Roman" w:cs="Times New Roman"/>
-                    <w:sz w:val="26"/>
-                    <w:szCs w:val="26"/>
-                  </w:rPr>
-                  <w:t>tên</w:t>
-                </w:r>
-                <w:proofErr w:type="spellEnd"/>
               </w:p>
             </w:tc>
             <w:tc>
@@ -751,34 +680,14 @@
                     <w:szCs w:val="26"/>
                   </w:rPr>
                 </w:pPr>
-                <w:proofErr w:type="spellStart"/>
                 <w:r>
                   <w:rPr>
                     <w:rFonts w:ascii="Times New Roman" w:hAnsi="Times New Roman" w:cs="Times New Roman"/>
                     <w:sz w:val="26"/>
                     <w:szCs w:val="26"/>
                   </w:rPr>
-                  <w:t>Ghi</w:t>
+                  <w:t>Ghi chú</w:t>
                 </w:r>
-                <w:proofErr w:type="spellEnd"/>
-                <w:r>
-                  <w:rPr>
-                    <w:rFonts w:ascii="Times New Roman" w:hAnsi="Times New Roman" w:cs="Times New Roman"/>
-                    <w:sz w:val="26"/>
-                    <w:szCs w:val="26"/>
-                  </w:rPr>
-                  <w:t xml:space="preserve"> </w:t>
-                </w:r>
-                <w:proofErr w:type="spellStart"/>
-                <w:r>
-                  <w:rPr>
-                    <w:rFonts w:ascii="Times New Roman" w:hAnsi="Times New Roman" w:cs="Times New Roman"/>
-                    <w:sz w:val="26"/>
-                    <w:szCs w:val="26"/>
-                  </w:rPr>
-                  <w:t>chú</w:t>
-                </w:r>
-                <w:proofErr w:type="spellEnd"/>
               </w:p>
             </w:tc>
           </w:tr>
@@ -876,34 +785,14 @@
                     <w:szCs w:val="26"/>
                   </w:rPr>
                 </w:pPr>
-                <w:proofErr w:type="spellStart"/>
                 <w:r>
                   <w:rPr>
                     <w:rFonts w:ascii="Times New Roman" w:hAnsi="Times New Roman" w:cs="Times New Roman"/>
                     <w:sz w:val="26"/>
                     <w:szCs w:val="26"/>
                   </w:rPr>
-                  <w:t>Nhóm</w:t>
+                  <w:t>Nhóm trưởng</w:t>
                 </w:r>
-                <w:proofErr w:type="spellEnd"/>
-                <w:r>
-                  <w:rPr>
-                    <w:rFonts w:ascii="Times New Roman" w:hAnsi="Times New Roman" w:cs="Times New Roman"/>
-                    <w:sz w:val="26"/>
-                    <w:szCs w:val="26"/>
-                  </w:rPr>
-                  <w:t xml:space="preserve"> </w:t>
-                </w:r>
-                <w:proofErr w:type="spellStart"/>
-                <w:r>
-                  <w:rPr>
-                    <w:rFonts w:ascii="Times New Roman" w:hAnsi="Times New Roman" w:cs="Times New Roman"/>
-                    <w:sz w:val="26"/>
-                    <w:szCs w:val="26"/>
-                  </w:rPr>
-                  <w:t>trưởng</w:t>
-                </w:r>
-                <w:proofErr w:type="spellEnd"/>
               </w:p>
             </w:tc>
           </w:tr>
@@ -951,23 +840,13 @@
                     <w:szCs w:val="26"/>
                   </w:rPr>
                 </w:pPr>
-                <w:proofErr w:type="spellStart"/>
                 <w:r>
                   <w:rPr>
                     <w:rFonts w:ascii="Times New Roman" w:hAnsi="Times New Roman" w:cs="Times New Roman"/>
                     <w:sz w:val="26"/>
                     <w:szCs w:val="26"/>
                   </w:rPr>
-                  <w:t>Trần</w:t>
-                </w:r>
-                <w:proofErr w:type="spellEnd"/>
-                <w:r>
-                  <w:rPr>
-                    <w:rFonts w:ascii="Times New Roman" w:hAnsi="Times New Roman" w:cs="Times New Roman"/>
-                    <w:sz w:val="26"/>
-                    <w:szCs w:val="26"/>
-                  </w:rPr>
-                  <w:t xml:space="preserve"> Thành Đạt</w:t>
+                  <w:t>Trần Thành Đạt</w:t>
                 </w:r>
               </w:p>
             </w:tc>
@@ -1156,23 +1035,13 @@
                     <w:szCs w:val="26"/>
                   </w:rPr>
                 </w:pPr>
-                <w:proofErr w:type="spellStart"/>
                 <w:r>
                   <w:rPr>
                     <w:rFonts w:ascii="Times New Roman" w:hAnsi="Times New Roman" w:cs="Times New Roman"/>
                     <w:sz w:val="26"/>
                     <w:szCs w:val="26"/>
                   </w:rPr>
-                  <w:t>Trần</w:t>
-                </w:r>
-                <w:proofErr w:type="spellEnd"/>
-                <w:r>
-                  <w:rPr>
-                    <w:rFonts w:ascii="Times New Roman" w:hAnsi="Times New Roman" w:cs="Times New Roman"/>
-                    <w:sz w:val="26"/>
-                    <w:szCs w:val="26"/>
-                  </w:rPr>
-                  <w:t xml:space="preserve"> Văn Triều</w:t>
+                  <w:t>Trần Văn Triều</w:t>
                 </w:r>
               </w:p>
             </w:tc>
@@ -3179,20 +3048,10 @@
         <w:pStyle w:val="Heading2"/>
       </w:pPr>
       <w:bookmarkStart w:id="1" w:name="_Toc41542386"/>
-      <w:proofErr w:type="spellStart"/>
       <w:r>
-        <w:t>Mục</w:t>
-      </w:r>
-      <w:proofErr w:type="spellEnd"/>
-      <w:r>
-        <w:t xml:space="preserve"> </w:t>
-      </w:r>
-      <w:proofErr w:type="spellStart"/>
-      <w:r>
-        <w:t>đích</w:t>
+        <w:t>Mục đích</w:t>
       </w:r>
       <w:bookmarkEnd w:id="1"/>
-      <w:proofErr w:type="spellEnd"/>
     </w:p>
     <w:p>
       <w:pPr>
@@ -3204,7 +3063,6 @@
           <w:szCs w:val="26"/>
         </w:rPr>
       </w:pPr>
-      <w:proofErr w:type="spellStart"/>
       <w:r>
         <w:rPr>
           <w:rFonts w:cstheme="minorHAnsi"/>
@@ -3213,9 +3071,20 @@
           <w:sz w:val="26"/>
           <w:szCs w:val="26"/>
         </w:rPr>
-        <w:t>Giới</w:t>
+        <w:t xml:space="preserve">Giới thiệu tổng quan về website, nhu cầu thực tế như thế nào cho việc tạo ra  website </w:t>
       </w:r>
-      <w:proofErr w:type="spellEnd"/>
+    </w:p>
+    <w:p>
+      <w:pPr>
+        <w:spacing w:after="200" w:line="276" w:lineRule="auto"/>
+        <w:rPr>
+          <w:rFonts w:ascii="Times New Roman" w:hAnsi="Times New Roman" w:cs="Times New Roman"/>
+          <w:i/>
+          <w:color w:val="FF0000"/>
+          <w:sz w:val="26"/>
+          <w:szCs w:val="26"/>
+        </w:rPr>
+      </w:pPr>
       <w:r>
         <w:rPr>
           <w:rFonts w:cstheme="minorHAnsi"/>
@@ -3224,616 +3093,8 @@
           <w:sz w:val="26"/>
           <w:szCs w:val="26"/>
         </w:rPr>
-        <w:t xml:space="preserve"> </w:t>
+        <w:t>Mục đích chung của Website đối với từng đối tượng sử dụng (user, admin, )</w:t>
       </w:r>
-      <w:proofErr w:type="spellStart"/>
-      <w:r>
-        <w:rPr>
-          <w:rFonts w:cstheme="minorHAnsi"/>
-          <w:i/>
-          <w:color w:val="FF0000"/>
-          <w:sz w:val="26"/>
-          <w:szCs w:val="26"/>
-        </w:rPr>
-        <w:t>thiệu</w:t>
-      </w:r>
-      <w:proofErr w:type="spellEnd"/>
-      <w:r>
-        <w:rPr>
-          <w:rFonts w:cstheme="minorHAnsi"/>
-          <w:i/>
-          <w:color w:val="FF0000"/>
-          <w:sz w:val="26"/>
-          <w:szCs w:val="26"/>
-        </w:rPr>
-        <w:t xml:space="preserve"> </w:t>
-      </w:r>
-      <w:proofErr w:type="spellStart"/>
-      <w:r>
-        <w:rPr>
-          <w:rFonts w:cstheme="minorHAnsi"/>
-          <w:i/>
-          <w:color w:val="FF0000"/>
-          <w:sz w:val="26"/>
-          <w:szCs w:val="26"/>
-        </w:rPr>
-        <w:t>tổng</w:t>
-      </w:r>
-      <w:proofErr w:type="spellEnd"/>
-      <w:r>
-        <w:rPr>
-          <w:rFonts w:cstheme="minorHAnsi"/>
-          <w:i/>
-          <w:color w:val="FF0000"/>
-          <w:sz w:val="26"/>
-          <w:szCs w:val="26"/>
-        </w:rPr>
-        <w:t xml:space="preserve"> </w:t>
-      </w:r>
-      <w:proofErr w:type="spellStart"/>
-      <w:r>
-        <w:rPr>
-          <w:rFonts w:cstheme="minorHAnsi"/>
-          <w:i/>
-          <w:color w:val="FF0000"/>
-          <w:sz w:val="26"/>
-          <w:szCs w:val="26"/>
-        </w:rPr>
-        <w:t>quan</w:t>
-      </w:r>
-      <w:proofErr w:type="spellEnd"/>
-      <w:r>
-        <w:rPr>
-          <w:rFonts w:cstheme="minorHAnsi"/>
-          <w:i/>
-          <w:color w:val="FF0000"/>
-          <w:sz w:val="26"/>
-          <w:szCs w:val="26"/>
-        </w:rPr>
-        <w:t xml:space="preserve"> </w:t>
-      </w:r>
-      <w:proofErr w:type="spellStart"/>
-      <w:r>
-        <w:rPr>
-          <w:rFonts w:cstheme="minorHAnsi"/>
-          <w:i/>
-          <w:color w:val="FF0000"/>
-          <w:sz w:val="26"/>
-          <w:szCs w:val="26"/>
-        </w:rPr>
-        <w:t>về</w:t>
-      </w:r>
-      <w:proofErr w:type="spellEnd"/>
-      <w:r>
-        <w:rPr>
-          <w:rFonts w:cstheme="minorHAnsi"/>
-          <w:i/>
-          <w:color w:val="FF0000"/>
-          <w:sz w:val="26"/>
-          <w:szCs w:val="26"/>
-        </w:rPr>
-        <w:t xml:space="preserve"> website, </w:t>
-      </w:r>
-      <w:proofErr w:type="spellStart"/>
-      <w:r>
-        <w:rPr>
-          <w:rFonts w:cstheme="minorHAnsi"/>
-          <w:i/>
-          <w:color w:val="FF0000"/>
-          <w:sz w:val="26"/>
-          <w:szCs w:val="26"/>
-        </w:rPr>
-        <w:t>nhu</w:t>
-      </w:r>
-      <w:proofErr w:type="spellEnd"/>
-      <w:r>
-        <w:rPr>
-          <w:rFonts w:cstheme="minorHAnsi"/>
-          <w:i/>
-          <w:color w:val="FF0000"/>
-          <w:sz w:val="26"/>
-          <w:szCs w:val="26"/>
-        </w:rPr>
-        <w:t xml:space="preserve"> </w:t>
-      </w:r>
-      <w:proofErr w:type="spellStart"/>
-      <w:r>
-        <w:rPr>
-          <w:rFonts w:cstheme="minorHAnsi"/>
-          <w:i/>
-          <w:color w:val="FF0000"/>
-          <w:sz w:val="26"/>
-          <w:szCs w:val="26"/>
-        </w:rPr>
-        <w:t>cầu</w:t>
-      </w:r>
-      <w:proofErr w:type="spellEnd"/>
-      <w:r>
-        <w:rPr>
-          <w:rFonts w:cstheme="minorHAnsi"/>
-          <w:i/>
-          <w:color w:val="FF0000"/>
-          <w:sz w:val="26"/>
-          <w:szCs w:val="26"/>
-        </w:rPr>
-        <w:t xml:space="preserve"> </w:t>
-      </w:r>
-      <w:proofErr w:type="spellStart"/>
-      <w:r>
-        <w:rPr>
-          <w:rFonts w:cstheme="minorHAnsi"/>
-          <w:i/>
-          <w:color w:val="FF0000"/>
-          <w:sz w:val="26"/>
-          <w:szCs w:val="26"/>
-        </w:rPr>
-        <w:t>thực</w:t>
-      </w:r>
-      <w:proofErr w:type="spellEnd"/>
-      <w:r>
-        <w:rPr>
-          <w:rFonts w:cstheme="minorHAnsi"/>
-          <w:i/>
-          <w:color w:val="FF0000"/>
-          <w:sz w:val="26"/>
-          <w:szCs w:val="26"/>
-        </w:rPr>
-        <w:t xml:space="preserve"> </w:t>
-      </w:r>
-      <w:proofErr w:type="spellStart"/>
-      <w:r>
-        <w:rPr>
-          <w:rFonts w:cstheme="minorHAnsi"/>
-          <w:i/>
-          <w:color w:val="FF0000"/>
-          <w:sz w:val="26"/>
-          <w:szCs w:val="26"/>
-        </w:rPr>
-        <w:t>tế</w:t>
-      </w:r>
-      <w:proofErr w:type="spellEnd"/>
-      <w:r>
-        <w:rPr>
-          <w:rFonts w:cstheme="minorHAnsi"/>
-          <w:i/>
-          <w:color w:val="FF0000"/>
-          <w:sz w:val="26"/>
-          <w:szCs w:val="26"/>
-        </w:rPr>
-        <w:t xml:space="preserve"> </w:t>
-      </w:r>
-      <w:proofErr w:type="spellStart"/>
-      <w:r>
-        <w:rPr>
-          <w:rFonts w:cstheme="minorHAnsi"/>
-          <w:i/>
-          <w:color w:val="FF0000"/>
-          <w:sz w:val="26"/>
-          <w:szCs w:val="26"/>
-        </w:rPr>
-        <w:t>như</w:t>
-      </w:r>
-      <w:proofErr w:type="spellEnd"/>
-      <w:r>
-        <w:rPr>
-          <w:rFonts w:cstheme="minorHAnsi"/>
-          <w:i/>
-          <w:color w:val="FF0000"/>
-          <w:sz w:val="26"/>
-          <w:szCs w:val="26"/>
-        </w:rPr>
-        <w:t xml:space="preserve"> </w:t>
-      </w:r>
-      <w:proofErr w:type="spellStart"/>
-      <w:r>
-        <w:rPr>
-          <w:rFonts w:cstheme="minorHAnsi"/>
-          <w:i/>
-          <w:color w:val="FF0000"/>
-          <w:sz w:val="26"/>
-          <w:szCs w:val="26"/>
-        </w:rPr>
-        <w:t>thế</w:t>
-      </w:r>
-      <w:proofErr w:type="spellEnd"/>
-      <w:r>
-        <w:rPr>
-          <w:rFonts w:cstheme="minorHAnsi"/>
-          <w:i/>
-          <w:color w:val="FF0000"/>
-          <w:sz w:val="26"/>
-          <w:szCs w:val="26"/>
-        </w:rPr>
-        <w:t xml:space="preserve"> </w:t>
-      </w:r>
-      <w:proofErr w:type="spellStart"/>
-      <w:r>
-        <w:rPr>
-          <w:rFonts w:cstheme="minorHAnsi"/>
-          <w:i/>
-          <w:color w:val="FF0000"/>
-          <w:sz w:val="26"/>
-          <w:szCs w:val="26"/>
-        </w:rPr>
-        <w:t>nào</w:t>
-      </w:r>
-      <w:proofErr w:type="spellEnd"/>
-      <w:r>
-        <w:rPr>
-          <w:rFonts w:cstheme="minorHAnsi"/>
-          <w:i/>
-          <w:color w:val="FF0000"/>
-          <w:sz w:val="26"/>
-          <w:szCs w:val="26"/>
-        </w:rPr>
-        <w:t xml:space="preserve"> </w:t>
-      </w:r>
-      <w:proofErr w:type="spellStart"/>
-      <w:r>
-        <w:rPr>
-          <w:rFonts w:cstheme="minorHAnsi"/>
-          <w:i/>
-          <w:color w:val="FF0000"/>
-          <w:sz w:val="26"/>
-          <w:szCs w:val="26"/>
-        </w:rPr>
-        <w:t>cho</w:t>
-      </w:r>
-      <w:proofErr w:type="spellEnd"/>
-      <w:r>
-        <w:rPr>
-          <w:rFonts w:cstheme="minorHAnsi"/>
-          <w:i/>
-          <w:color w:val="FF0000"/>
-          <w:sz w:val="26"/>
-          <w:szCs w:val="26"/>
-        </w:rPr>
-        <w:t xml:space="preserve"> </w:t>
-      </w:r>
-      <w:proofErr w:type="spellStart"/>
-      <w:r>
-        <w:rPr>
-          <w:rFonts w:cstheme="minorHAnsi"/>
-          <w:i/>
-          <w:color w:val="FF0000"/>
-          <w:sz w:val="26"/>
-          <w:szCs w:val="26"/>
-        </w:rPr>
-        <w:t>việc</w:t>
-      </w:r>
-      <w:proofErr w:type="spellEnd"/>
-      <w:r>
-        <w:rPr>
-          <w:rFonts w:cstheme="minorHAnsi"/>
-          <w:i/>
-          <w:color w:val="FF0000"/>
-          <w:sz w:val="26"/>
-          <w:szCs w:val="26"/>
-        </w:rPr>
-        <w:t xml:space="preserve"> </w:t>
-      </w:r>
-      <w:proofErr w:type="spellStart"/>
-      <w:r>
-        <w:rPr>
-          <w:rFonts w:cstheme="minorHAnsi"/>
-          <w:i/>
-          <w:color w:val="FF0000"/>
-          <w:sz w:val="26"/>
-          <w:szCs w:val="26"/>
-        </w:rPr>
-        <w:t>tạo</w:t>
-      </w:r>
-      <w:proofErr w:type="spellEnd"/>
-      <w:r>
-        <w:rPr>
-          <w:rFonts w:cstheme="minorHAnsi"/>
-          <w:i/>
-          <w:color w:val="FF0000"/>
-          <w:sz w:val="26"/>
-          <w:szCs w:val="26"/>
-        </w:rPr>
-        <w:t xml:space="preserve"> </w:t>
-      </w:r>
-      <w:proofErr w:type="spellStart"/>
-      <w:proofErr w:type="gramStart"/>
-      <w:r>
-        <w:rPr>
-          <w:rFonts w:cstheme="minorHAnsi"/>
-          <w:i/>
-          <w:color w:val="FF0000"/>
-          <w:sz w:val="26"/>
-          <w:szCs w:val="26"/>
-        </w:rPr>
-        <w:t>ra</w:t>
-      </w:r>
-      <w:proofErr w:type="spellEnd"/>
-      <w:r>
-        <w:rPr>
-          <w:rFonts w:cstheme="minorHAnsi"/>
-          <w:i/>
-          <w:color w:val="FF0000"/>
-          <w:sz w:val="26"/>
-          <w:szCs w:val="26"/>
-        </w:rPr>
-        <w:t xml:space="preserve">  website</w:t>
-      </w:r>
-      <w:proofErr w:type="gramEnd"/>
-      <w:r>
-        <w:rPr>
-          <w:rFonts w:cstheme="minorHAnsi"/>
-          <w:i/>
-          <w:color w:val="FF0000"/>
-          <w:sz w:val="26"/>
-          <w:szCs w:val="26"/>
-        </w:rPr>
-        <w:t xml:space="preserve"> </w:t>
-      </w:r>
-    </w:p>
-    <w:p>
-      <w:pPr>
-        <w:spacing w:after="200" w:line="276" w:lineRule="auto"/>
-        <w:rPr>
-          <w:rFonts w:ascii="Times New Roman" w:hAnsi="Times New Roman" w:cs="Times New Roman"/>
-          <w:i/>
-          <w:color w:val="FF0000"/>
-          <w:sz w:val="26"/>
-          <w:szCs w:val="26"/>
-        </w:rPr>
-      </w:pPr>
-      <w:proofErr w:type="spellStart"/>
-      <w:r>
-        <w:rPr>
-          <w:rFonts w:cstheme="minorHAnsi"/>
-          <w:i/>
-          <w:color w:val="FF0000"/>
-          <w:sz w:val="26"/>
-          <w:szCs w:val="26"/>
-        </w:rPr>
-        <w:t>Mục</w:t>
-      </w:r>
-      <w:proofErr w:type="spellEnd"/>
-      <w:r>
-        <w:rPr>
-          <w:rFonts w:cstheme="minorHAnsi"/>
-          <w:i/>
-          <w:color w:val="FF0000"/>
-          <w:sz w:val="26"/>
-          <w:szCs w:val="26"/>
-        </w:rPr>
-        <w:t xml:space="preserve"> </w:t>
-      </w:r>
-      <w:proofErr w:type="spellStart"/>
-      <w:r>
-        <w:rPr>
-          <w:rFonts w:cstheme="minorHAnsi"/>
-          <w:i/>
-          <w:color w:val="FF0000"/>
-          <w:sz w:val="26"/>
-          <w:szCs w:val="26"/>
-        </w:rPr>
-        <w:t>đích</w:t>
-      </w:r>
-      <w:proofErr w:type="spellEnd"/>
-      <w:r>
-        <w:rPr>
-          <w:rFonts w:cstheme="minorHAnsi"/>
-          <w:i/>
-          <w:color w:val="FF0000"/>
-          <w:sz w:val="26"/>
-          <w:szCs w:val="26"/>
-        </w:rPr>
-        <w:t xml:space="preserve"> </w:t>
-      </w:r>
-      <w:proofErr w:type="spellStart"/>
-      <w:r>
-        <w:rPr>
-          <w:rFonts w:cstheme="minorHAnsi"/>
-          <w:i/>
-          <w:color w:val="FF0000"/>
-          <w:sz w:val="26"/>
-          <w:szCs w:val="26"/>
-        </w:rPr>
-        <w:t>chung</w:t>
-      </w:r>
-      <w:proofErr w:type="spellEnd"/>
-      <w:r>
-        <w:rPr>
-          <w:rFonts w:cstheme="minorHAnsi"/>
-          <w:i/>
-          <w:color w:val="FF0000"/>
-          <w:sz w:val="26"/>
-          <w:szCs w:val="26"/>
-        </w:rPr>
-        <w:t xml:space="preserve"> </w:t>
-      </w:r>
-      <w:proofErr w:type="spellStart"/>
-      <w:r>
-        <w:rPr>
-          <w:rFonts w:cstheme="minorHAnsi"/>
-          <w:i/>
-          <w:color w:val="FF0000"/>
-          <w:sz w:val="26"/>
-          <w:szCs w:val="26"/>
-        </w:rPr>
-        <w:t>của</w:t>
-      </w:r>
-      <w:proofErr w:type="spellEnd"/>
-      <w:r>
-        <w:rPr>
-          <w:rFonts w:cstheme="minorHAnsi"/>
-          <w:i/>
-          <w:color w:val="FF0000"/>
-          <w:sz w:val="26"/>
-          <w:szCs w:val="26"/>
-        </w:rPr>
-        <w:t xml:space="preserve"> Website </w:t>
-      </w:r>
-      <w:proofErr w:type="spellStart"/>
-      <w:r>
-        <w:rPr>
-          <w:rFonts w:cstheme="minorHAnsi"/>
-          <w:i/>
-          <w:color w:val="FF0000"/>
-          <w:sz w:val="26"/>
-          <w:szCs w:val="26"/>
-        </w:rPr>
-        <w:t>đối</w:t>
-      </w:r>
-      <w:proofErr w:type="spellEnd"/>
-      <w:r>
-        <w:rPr>
-          <w:rFonts w:cstheme="minorHAnsi"/>
-          <w:i/>
-          <w:color w:val="FF0000"/>
-          <w:sz w:val="26"/>
-          <w:szCs w:val="26"/>
-        </w:rPr>
-        <w:t xml:space="preserve"> </w:t>
-      </w:r>
-      <w:proofErr w:type="spellStart"/>
-      <w:r>
-        <w:rPr>
-          <w:rFonts w:cstheme="minorHAnsi"/>
-          <w:i/>
-          <w:color w:val="FF0000"/>
-          <w:sz w:val="26"/>
-          <w:szCs w:val="26"/>
-        </w:rPr>
-        <w:t>với</w:t>
-      </w:r>
-      <w:proofErr w:type="spellEnd"/>
-      <w:r>
-        <w:rPr>
-          <w:rFonts w:cstheme="minorHAnsi"/>
-          <w:i/>
-          <w:color w:val="FF0000"/>
-          <w:sz w:val="26"/>
-          <w:szCs w:val="26"/>
-        </w:rPr>
-        <w:t xml:space="preserve"> </w:t>
-      </w:r>
-      <w:proofErr w:type="spellStart"/>
-      <w:r>
-        <w:rPr>
-          <w:rFonts w:cstheme="minorHAnsi"/>
-          <w:i/>
-          <w:color w:val="FF0000"/>
-          <w:sz w:val="26"/>
-          <w:szCs w:val="26"/>
-        </w:rPr>
-        <w:t>từng</w:t>
-      </w:r>
-      <w:proofErr w:type="spellEnd"/>
-      <w:r>
-        <w:rPr>
-          <w:rFonts w:cstheme="minorHAnsi"/>
-          <w:i/>
-          <w:color w:val="FF0000"/>
-          <w:sz w:val="26"/>
-          <w:szCs w:val="26"/>
-        </w:rPr>
-        <w:t xml:space="preserve"> </w:t>
-      </w:r>
-      <w:proofErr w:type="spellStart"/>
-      <w:r>
-        <w:rPr>
-          <w:rFonts w:cstheme="minorHAnsi"/>
-          <w:i/>
-          <w:color w:val="FF0000"/>
-          <w:sz w:val="26"/>
-          <w:szCs w:val="26"/>
-        </w:rPr>
-        <w:t>đối</w:t>
-      </w:r>
-      <w:proofErr w:type="spellEnd"/>
-      <w:r>
-        <w:rPr>
-          <w:rFonts w:cstheme="minorHAnsi"/>
-          <w:i/>
-          <w:color w:val="FF0000"/>
-          <w:sz w:val="26"/>
-          <w:szCs w:val="26"/>
-        </w:rPr>
-        <w:t xml:space="preserve"> </w:t>
-      </w:r>
-      <w:proofErr w:type="spellStart"/>
-      <w:r>
-        <w:rPr>
-          <w:rFonts w:cstheme="minorHAnsi"/>
-          <w:i/>
-          <w:color w:val="FF0000"/>
-          <w:sz w:val="26"/>
-          <w:szCs w:val="26"/>
-        </w:rPr>
-        <w:t>tượng</w:t>
-      </w:r>
-      <w:proofErr w:type="spellEnd"/>
-      <w:r>
-        <w:rPr>
-          <w:rFonts w:cstheme="minorHAnsi"/>
-          <w:i/>
-          <w:color w:val="FF0000"/>
-          <w:sz w:val="26"/>
-          <w:szCs w:val="26"/>
-        </w:rPr>
-        <w:t xml:space="preserve"> </w:t>
-      </w:r>
-      <w:proofErr w:type="spellStart"/>
-      <w:r>
-        <w:rPr>
-          <w:rFonts w:cstheme="minorHAnsi"/>
-          <w:i/>
-          <w:color w:val="FF0000"/>
-          <w:sz w:val="26"/>
-          <w:szCs w:val="26"/>
-        </w:rPr>
-        <w:t>sử</w:t>
-      </w:r>
-      <w:proofErr w:type="spellEnd"/>
-      <w:r>
-        <w:rPr>
-          <w:rFonts w:cstheme="minorHAnsi"/>
-          <w:i/>
-          <w:color w:val="FF0000"/>
-          <w:sz w:val="26"/>
-          <w:szCs w:val="26"/>
-        </w:rPr>
-        <w:t xml:space="preserve"> </w:t>
-      </w:r>
-      <w:proofErr w:type="spellStart"/>
-      <w:r>
-        <w:rPr>
-          <w:rFonts w:cstheme="minorHAnsi"/>
-          <w:i/>
-          <w:color w:val="FF0000"/>
-          <w:sz w:val="26"/>
-          <w:szCs w:val="26"/>
-        </w:rPr>
-        <w:t>dụng</w:t>
-      </w:r>
-      <w:proofErr w:type="spellEnd"/>
-      <w:r>
-        <w:rPr>
-          <w:rFonts w:cstheme="minorHAnsi"/>
-          <w:i/>
-          <w:color w:val="FF0000"/>
-          <w:sz w:val="26"/>
-          <w:szCs w:val="26"/>
-        </w:rPr>
-        <w:t xml:space="preserve"> (user, admin</w:t>
-      </w:r>
-      <w:proofErr w:type="gramStart"/>
-      <w:r>
-        <w:rPr>
-          <w:rFonts w:cstheme="minorHAnsi"/>
-          <w:i/>
-          <w:color w:val="FF0000"/>
-          <w:sz w:val="26"/>
-          <w:szCs w:val="26"/>
-        </w:rPr>
-        <w:t>, )</w:t>
-      </w:r>
-      <w:proofErr w:type="gramEnd"/>
     </w:p>
     <w:p>
       <w:pPr>
@@ -3864,78 +3125,12 @@
         <w:pStyle w:val="Heading2"/>
       </w:pPr>
       <w:bookmarkStart w:id="2" w:name="_Toc41542387"/>
-      <w:proofErr w:type="spellStart"/>
       <w:r>
-        <w:t>Cơ</w:t>
-      </w:r>
-      <w:proofErr w:type="spellEnd"/>
-      <w:r>
-        <w:t xml:space="preserve"> </w:t>
-      </w:r>
-      <w:proofErr w:type="spellStart"/>
-      <w:r>
-        <w:t>sở</w:t>
-      </w:r>
-      <w:proofErr w:type="spellEnd"/>
-      <w:r>
-        <w:t xml:space="preserve"> </w:t>
-      </w:r>
-      <w:proofErr w:type="spellStart"/>
-      <w:r>
-        <w:t>lý</w:t>
-      </w:r>
-      <w:proofErr w:type="spellEnd"/>
-      <w:r>
-        <w:t xml:space="preserve"> </w:t>
-      </w:r>
-      <w:proofErr w:type="spellStart"/>
-      <w:r>
-        <w:t>thuyết</w:t>
-      </w:r>
-      <w:proofErr w:type="spellEnd"/>
-      <w:r>
-        <w:t xml:space="preserve"> </w:t>
-      </w:r>
-      <w:proofErr w:type="spellStart"/>
-      <w:r>
-        <w:t>và</w:t>
-      </w:r>
-      <w:proofErr w:type="spellEnd"/>
-      <w:r>
-        <w:t xml:space="preserve"> </w:t>
-      </w:r>
-      <w:proofErr w:type="spellStart"/>
-      <w:r>
-        <w:t>các</w:t>
-      </w:r>
-      <w:proofErr w:type="spellEnd"/>
-      <w:r>
-        <w:t xml:space="preserve"> </w:t>
-      </w:r>
-      <w:proofErr w:type="spellStart"/>
-      <w:r>
-        <w:t>thông</w:t>
-      </w:r>
-      <w:proofErr w:type="spellEnd"/>
-      <w:r>
-        <w:t xml:space="preserve"> tin</w:t>
+        <w:t>Cơ sở lý thuyết và các thông tin</w:t>
       </w:r>
       <w:r>
-        <w:t xml:space="preserve"> </w:t>
+        <w:t xml:space="preserve"> kỹ thuật</w:t>
       </w:r>
-      <w:proofErr w:type="spellStart"/>
-      <w:r>
-        <w:t>kỹ</w:t>
-      </w:r>
-      <w:proofErr w:type="spellEnd"/>
-      <w:r>
-        <w:t xml:space="preserve"> </w:t>
-      </w:r>
-      <w:proofErr w:type="spellStart"/>
-      <w:r>
-        <w:t>thuật</w:t>
-      </w:r>
-      <w:proofErr w:type="spellEnd"/>
       <w:r>
         <w:t>:</w:t>
       </w:r>
@@ -3964,227 +3159,7 @@
           <w:sz w:val="26"/>
           <w:szCs w:val="26"/>
         </w:rPr>
-        <w:t xml:space="preserve">Các </w:t>
-      </w:r>
-      <w:proofErr w:type="spellStart"/>
-      <w:r>
-        <w:rPr>
-          <w:rFonts w:cstheme="minorHAnsi"/>
-          <w:i/>
-          <w:color w:val="FF0000"/>
-          <w:sz w:val="26"/>
-          <w:szCs w:val="26"/>
-        </w:rPr>
-        <w:t>kiến</w:t>
-      </w:r>
-      <w:proofErr w:type="spellEnd"/>
-      <w:r>
-        <w:rPr>
-          <w:rFonts w:cstheme="minorHAnsi"/>
-          <w:i/>
-          <w:color w:val="FF0000"/>
-          <w:sz w:val="26"/>
-          <w:szCs w:val="26"/>
-        </w:rPr>
-        <w:t xml:space="preserve"> </w:t>
-      </w:r>
-      <w:proofErr w:type="spellStart"/>
-      <w:r>
-        <w:rPr>
-          <w:rFonts w:cstheme="minorHAnsi"/>
-          <w:i/>
-          <w:color w:val="FF0000"/>
-          <w:sz w:val="26"/>
-          <w:szCs w:val="26"/>
-        </w:rPr>
-        <w:t>thức</w:t>
-      </w:r>
-      <w:proofErr w:type="spellEnd"/>
-      <w:r>
-        <w:rPr>
-          <w:rFonts w:cstheme="minorHAnsi"/>
-          <w:i/>
-          <w:color w:val="FF0000"/>
-          <w:sz w:val="26"/>
-          <w:szCs w:val="26"/>
-        </w:rPr>
-        <w:t xml:space="preserve"> </w:t>
-      </w:r>
-      <w:proofErr w:type="spellStart"/>
-      <w:r>
-        <w:rPr>
-          <w:rFonts w:cstheme="minorHAnsi"/>
-          <w:i/>
-          <w:color w:val="FF0000"/>
-          <w:sz w:val="26"/>
-          <w:szCs w:val="26"/>
-        </w:rPr>
-        <w:t>lý</w:t>
-      </w:r>
-      <w:proofErr w:type="spellEnd"/>
-      <w:r>
-        <w:rPr>
-          <w:rFonts w:cstheme="minorHAnsi"/>
-          <w:i/>
-          <w:color w:val="FF0000"/>
-          <w:sz w:val="26"/>
-          <w:szCs w:val="26"/>
-        </w:rPr>
-        <w:t xml:space="preserve"> </w:t>
-      </w:r>
-      <w:proofErr w:type="spellStart"/>
-      <w:r>
-        <w:rPr>
-          <w:rFonts w:cstheme="minorHAnsi"/>
-          <w:i/>
-          <w:color w:val="FF0000"/>
-          <w:sz w:val="26"/>
-          <w:szCs w:val="26"/>
-        </w:rPr>
-        <w:t>thuyết</w:t>
-      </w:r>
-      <w:proofErr w:type="spellEnd"/>
-      <w:r>
-        <w:rPr>
-          <w:rFonts w:cstheme="minorHAnsi"/>
-          <w:i/>
-          <w:color w:val="FF0000"/>
-          <w:sz w:val="26"/>
-          <w:szCs w:val="26"/>
-        </w:rPr>
-        <w:t xml:space="preserve"> </w:t>
-      </w:r>
-      <w:proofErr w:type="spellStart"/>
-      <w:r>
-        <w:rPr>
-          <w:rFonts w:cstheme="minorHAnsi"/>
-          <w:i/>
-          <w:color w:val="FF0000"/>
-          <w:sz w:val="26"/>
-          <w:szCs w:val="26"/>
-        </w:rPr>
-        <w:t>vận</w:t>
-      </w:r>
-      <w:proofErr w:type="spellEnd"/>
-      <w:r>
-        <w:rPr>
-          <w:rFonts w:cstheme="minorHAnsi"/>
-          <w:i/>
-          <w:color w:val="FF0000"/>
-          <w:sz w:val="26"/>
-          <w:szCs w:val="26"/>
-        </w:rPr>
-        <w:t xml:space="preserve"> </w:t>
-      </w:r>
-      <w:proofErr w:type="spellStart"/>
-      <w:r>
-        <w:rPr>
-          <w:rFonts w:cstheme="minorHAnsi"/>
-          <w:i/>
-          <w:color w:val="FF0000"/>
-          <w:sz w:val="26"/>
-          <w:szCs w:val="26"/>
-        </w:rPr>
-        <w:t>dụng</w:t>
-      </w:r>
-      <w:proofErr w:type="spellEnd"/>
-      <w:r>
-        <w:rPr>
-          <w:rFonts w:cstheme="minorHAnsi"/>
-          <w:i/>
-          <w:color w:val="FF0000"/>
-          <w:sz w:val="26"/>
-          <w:szCs w:val="26"/>
-        </w:rPr>
-        <w:t xml:space="preserve"> </w:t>
-      </w:r>
-      <w:proofErr w:type="spellStart"/>
-      <w:r>
-        <w:rPr>
-          <w:rFonts w:cstheme="minorHAnsi"/>
-          <w:i/>
-          <w:color w:val="FF0000"/>
-          <w:sz w:val="26"/>
-          <w:szCs w:val="26"/>
-        </w:rPr>
-        <w:t>cho</w:t>
-      </w:r>
-      <w:proofErr w:type="spellEnd"/>
-      <w:r>
-        <w:rPr>
-          <w:rFonts w:cstheme="minorHAnsi"/>
-          <w:i/>
-          <w:color w:val="FF0000"/>
-          <w:sz w:val="26"/>
-          <w:szCs w:val="26"/>
-        </w:rPr>
-        <w:t xml:space="preserve"> </w:t>
-      </w:r>
-      <w:proofErr w:type="spellStart"/>
-      <w:r>
-        <w:rPr>
-          <w:rFonts w:cstheme="minorHAnsi"/>
-          <w:i/>
-          <w:color w:val="FF0000"/>
-          <w:sz w:val="26"/>
-          <w:szCs w:val="26"/>
-        </w:rPr>
-        <w:t>việc</w:t>
-      </w:r>
-      <w:proofErr w:type="spellEnd"/>
-      <w:r>
-        <w:rPr>
-          <w:rFonts w:cstheme="minorHAnsi"/>
-          <w:i/>
-          <w:color w:val="FF0000"/>
-          <w:sz w:val="26"/>
-          <w:szCs w:val="26"/>
-        </w:rPr>
-        <w:t xml:space="preserve"> </w:t>
-      </w:r>
-      <w:proofErr w:type="spellStart"/>
-      <w:r>
-        <w:rPr>
-          <w:rFonts w:cstheme="minorHAnsi"/>
-          <w:i/>
-          <w:color w:val="FF0000"/>
-          <w:sz w:val="26"/>
-          <w:szCs w:val="26"/>
-        </w:rPr>
-        <w:t>hiện</w:t>
-      </w:r>
-      <w:proofErr w:type="spellEnd"/>
-      <w:r>
-        <w:rPr>
-          <w:rFonts w:cstheme="minorHAnsi"/>
-          <w:i/>
-          <w:color w:val="FF0000"/>
-          <w:sz w:val="26"/>
-          <w:szCs w:val="26"/>
-        </w:rPr>
-        <w:t xml:space="preserve"> </w:t>
-      </w:r>
-      <w:proofErr w:type="spellStart"/>
-      <w:r>
-        <w:rPr>
-          <w:rFonts w:cstheme="minorHAnsi"/>
-          <w:i/>
-          <w:color w:val="FF0000"/>
-          <w:sz w:val="26"/>
-          <w:szCs w:val="26"/>
-        </w:rPr>
-        <w:t>thực</w:t>
-      </w:r>
-      <w:proofErr w:type="spellEnd"/>
-      <w:r>
-        <w:rPr>
-          <w:rFonts w:cstheme="minorHAnsi"/>
-          <w:i/>
-          <w:color w:val="FF0000"/>
-          <w:sz w:val="26"/>
-          <w:szCs w:val="26"/>
-        </w:rPr>
-        <w:t xml:space="preserve"> website</w:t>
+        <w:t>Các kiến thức lý thuyết vận dụng cho việc hiện thực website</w:t>
       </w:r>
     </w:p>
     <w:p>
@@ -4280,7 +3255,6 @@
           <w:szCs w:val="26"/>
         </w:rPr>
       </w:pPr>
-      <w:proofErr w:type="spellStart"/>
       <w:r>
         <w:rPr>
           <w:rFonts w:cstheme="minorHAnsi"/>
@@ -4289,260 +3263,7 @@
           <w:sz w:val="26"/>
           <w:szCs w:val="26"/>
         </w:rPr>
-        <w:t>Trình</w:t>
-      </w:r>
-      <w:proofErr w:type="spellEnd"/>
-      <w:r>
-        <w:rPr>
-          <w:rFonts w:cstheme="minorHAnsi"/>
-          <w:i/>
-          <w:color w:val="FF0000"/>
-          <w:sz w:val="26"/>
-          <w:szCs w:val="26"/>
-        </w:rPr>
-        <w:t xml:space="preserve"> </w:t>
-      </w:r>
-      <w:proofErr w:type="spellStart"/>
-      <w:r>
-        <w:rPr>
-          <w:rFonts w:cstheme="minorHAnsi"/>
-          <w:i/>
-          <w:color w:val="FF0000"/>
-          <w:sz w:val="26"/>
-          <w:szCs w:val="26"/>
-        </w:rPr>
-        <w:t>bày</w:t>
-      </w:r>
-      <w:proofErr w:type="spellEnd"/>
-      <w:r>
-        <w:rPr>
-          <w:rFonts w:cstheme="minorHAnsi"/>
-          <w:i/>
-          <w:color w:val="FF0000"/>
-          <w:sz w:val="26"/>
-          <w:szCs w:val="26"/>
-        </w:rPr>
-        <w:t xml:space="preserve"> </w:t>
-      </w:r>
-      <w:proofErr w:type="spellStart"/>
-      <w:r>
-        <w:rPr>
-          <w:rFonts w:cstheme="minorHAnsi"/>
-          <w:i/>
-          <w:color w:val="FF0000"/>
-          <w:sz w:val="26"/>
-          <w:szCs w:val="26"/>
-        </w:rPr>
-        <w:t>lý</w:t>
-      </w:r>
-      <w:proofErr w:type="spellEnd"/>
-      <w:r>
-        <w:rPr>
-          <w:rFonts w:cstheme="minorHAnsi"/>
-          <w:i/>
-          <w:color w:val="FF0000"/>
-          <w:sz w:val="26"/>
-          <w:szCs w:val="26"/>
-        </w:rPr>
-        <w:t xml:space="preserve"> do, </w:t>
-      </w:r>
-      <w:proofErr w:type="spellStart"/>
-      <w:r>
-        <w:rPr>
-          <w:rFonts w:cstheme="minorHAnsi"/>
-          <w:i/>
-          <w:color w:val="FF0000"/>
-          <w:sz w:val="26"/>
-          <w:szCs w:val="26"/>
-        </w:rPr>
-        <w:t>các</w:t>
-      </w:r>
-      <w:proofErr w:type="spellEnd"/>
-      <w:r>
-        <w:rPr>
-          <w:rFonts w:cstheme="minorHAnsi"/>
-          <w:i/>
-          <w:color w:val="FF0000"/>
-          <w:sz w:val="26"/>
-          <w:szCs w:val="26"/>
-        </w:rPr>
-        <w:t xml:space="preserve"> </w:t>
-      </w:r>
-      <w:proofErr w:type="spellStart"/>
-      <w:r>
-        <w:rPr>
-          <w:rFonts w:cstheme="minorHAnsi"/>
-          <w:i/>
-          <w:color w:val="FF0000"/>
-          <w:sz w:val="26"/>
-          <w:szCs w:val="26"/>
-        </w:rPr>
-        <w:t>ưu</w:t>
-      </w:r>
-      <w:proofErr w:type="spellEnd"/>
-      <w:r>
-        <w:rPr>
-          <w:rFonts w:cstheme="minorHAnsi"/>
-          <w:i/>
-          <w:color w:val="FF0000"/>
-          <w:sz w:val="26"/>
-          <w:szCs w:val="26"/>
-        </w:rPr>
-        <w:t xml:space="preserve"> </w:t>
-      </w:r>
-      <w:proofErr w:type="spellStart"/>
-      <w:r>
-        <w:rPr>
-          <w:rFonts w:cstheme="minorHAnsi"/>
-          <w:i/>
-          <w:color w:val="FF0000"/>
-          <w:sz w:val="26"/>
-          <w:szCs w:val="26"/>
-        </w:rPr>
-        <w:t>điểm</w:t>
-      </w:r>
-      <w:proofErr w:type="spellEnd"/>
-      <w:r>
-        <w:rPr>
-          <w:rFonts w:cstheme="minorHAnsi"/>
-          <w:i/>
-          <w:color w:val="FF0000"/>
-          <w:sz w:val="26"/>
-          <w:szCs w:val="26"/>
-        </w:rPr>
-        <w:t xml:space="preserve"> </w:t>
-      </w:r>
-      <w:proofErr w:type="spellStart"/>
-      <w:r>
-        <w:rPr>
-          <w:rFonts w:cstheme="minorHAnsi"/>
-          <w:i/>
-          <w:color w:val="FF0000"/>
-          <w:sz w:val="26"/>
-          <w:szCs w:val="26"/>
-        </w:rPr>
-        <w:t>mà</w:t>
-      </w:r>
-      <w:proofErr w:type="spellEnd"/>
-      <w:r>
-        <w:rPr>
-          <w:rFonts w:cstheme="minorHAnsi"/>
-          <w:i/>
-          <w:color w:val="FF0000"/>
-          <w:sz w:val="26"/>
-          <w:szCs w:val="26"/>
-        </w:rPr>
-        <w:t xml:space="preserve"> </w:t>
-      </w:r>
-      <w:proofErr w:type="spellStart"/>
-      <w:r>
-        <w:rPr>
-          <w:rFonts w:cstheme="minorHAnsi"/>
-          <w:i/>
-          <w:color w:val="FF0000"/>
-          <w:sz w:val="26"/>
-          <w:szCs w:val="26"/>
-        </w:rPr>
-        <w:t>sv</w:t>
-      </w:r>
-      <w:proofErr w:type="spellEnd"/>
-      <w:r>
-        <w:rPr>
-          <w:rFonts w:cstheme="minorHAnsi"/>
-          <w:i/>
-          <w:color w:val="FF0000"/>
-          <w:sz w:val="26"/>
-          <w:szCs w:val="26"/>
-        </w:rPr>
-        <w:t xml:space="preserve"> </w:t>
-      </w:r>
-      <w:proofErr w:type="spellStart"/>
-      <w:r>
-        <w:rPr>
-          <w:rFonts w:cstheme="minorHAnsi"/>
-          <w:i/>
-          <w:color w:val="FF0000"/>
-          <w:sz w:val="26"/>
-          <w:szCs w:val="26"/>
-        </w:rPr>
-        <w:t>chọn</w:t>
-      </w:r>
-      <w:proofErr w:type="spellEnd"/>
-      <w:r>
-        <w:rPr>
-          <w:rFonts w:cstheme="minorHAnsi"/>
-          <w:i/>
-          <w:color w:val="FF0000"/>
-          <w:sz w:val="26"/>
-          <w:szCs w:val="26"/>
-        </w:rPr>
-        <w:t xml:space="preserve"> </w:t>
-      </w:r>
-      <w:proofErr w:type="spellStart"/>
-      <w:r>
-        <w:rPr>
-          <w:rFonts w:cstheme="minorHAnsi"/>
-          <w:i/>
-          <w:color w:val="FF0000"/>
-          <w:sz w:val="26"/>
-          <w:szCs w:val="26"/>
-        </w:rPr>
-        <w:t>để</w:t>
-      </w:r>
-      <w:proofErr w:type="spellEnd"/>
-      <w:r>
-        <w:rPr>
-          <w:rFonts w:cstheme="minorHAnsi"/>
-          <w:i/>
-          <w:color w:val="FF0000"/>
-          <w:sz w:val="26"/>
-          <w:szCs w:val="26"/>
-        </w:rPr>
-        <w:t xml:space="preserve"> </w:t>
-      </w:r>
-      <w:proofErr w:type="spellStart"/>
-      <w:r>
-        <w:rPr>
-          <w:rFonts w:cstheme="minorHAnsi"/>
-          <w:i/>
-          <w:color w:val="FF0000"/>
-          <w:sz w:val="26"/>
-          <w:szCs w:val="26"/>
-        </w:rPr>
-        <w:t>áp</w:t>
-      </w:r>
-      <w:proofErr w:type="spellEnd"/>
-      <w:r>
-        <w:rPr>
-          <w:rFonts w:cstheme="minorHAnsi"/>
-          <w:i/>
-          <w:color w:val="FF0000"/>
-          <w:sz w:val="26"/>
-          <w:szCs w:val="26"/>
-        </w:rPr>
-        <w:t xml:space="preserve"> </w:t>
-      </w:r>
-      <w:proofErr w:type="spellStart"/>
-      <w:r>
-        <w:rPr>
-          <w:rFonts w:cstheme="minorHAnsi"/>
-          <w:i/>
-          <w:color w:val="FF0000"/>
-          <w:sz w:val="26"/>
-          <w:szCs w:val="26"/>
-        </w:rPr>
-        <w:t>dụng</w:t>
-      </w:r>
-      <w:proofErr w:type="spellEnd"/>
-      <w:r>
-        <w:rPr>
-          <w:rFonts w:cstheme="minorHAnsi"/>
-          <w:i/>
-          <w:color w:val="FF0000"/>
-          <w:sz w:val="26"/>
-          <w:szCs w:val="26"/>
-        </w:rPr>
-        <w:t xml:space="preserve"> </w:t>
+        <w:t xml:space="preserve">Trình bày lý do, các ưu điểm mà sv chọn để áp dụng </w:t>
       </w:r>
     </w:p>
     <w:p>
@@ -4566,108 +3287,8 @@
           <w:sz w:val="26"/>
           <w:szCs w:val="26"/>
         </w:rPr>
-        <w:t xml:space="preserve">Thư </w:t>
+        <w:t>Thư viện sử dụng (jQuery), nguồn gốc</w:t>
       </w:r>
-      <w:proofErr w:type="spellStart"/>
-      <w:r>
-        <w:rPr>
-          <w:rFonts w:cstheme="minorHAnsi"/>
-          <w:i/>
-          <w:color w:val="FF0000"/>
-          <w:sz w:val="26"/>
-          <w:szCs w:val="26"/>
-        </w:rPr>
-        <w:t>viện</w:t>
-      </w:r>
-      <w:proofErr w:type="spellEnd"/>
-      <w:r>
-        <w:rPr>
-          <w:rFonts w:cstheme="minorHAnsi"/>
-          <w:i/>
-          <w:color w:val="FF0000"/>
-          <w:sz w:val="26"/>
-          <w:szCs w:val="26"/>
-        </w:rPr>
-        <w:t xml:space="preserve"> </w:t>
-      </w:r>
-      <w:proofErr w:type="spellStart"/>
-      <w:r>
-        <w:rPr>
-          <w:rFonts w:cstheme="minorHAnsi"/>
-          <w:i/>
-          <w:color w:val="FF0000"/>
-          <w:sz w:val="26"/>
-          <w:szCs w:val="26"/>
-        </w:rPr>
-        <w:t>sử</w:t>
-      </w:r>
-      <w:proofErr w:type="spellEnd"/>
-      <w:r>
-        <w:rPr>
-          <w:rFonts w:cstheme="minorHAnsi"/>
-          <w:i/>
-          <w:color w:val="FF0000"/>
-          <w:sz w:val="26"/>
-          <w:szCs w:val="26"/>
-        </w:rPr>
-        <w:t xml:space="preserve"> </w:t>
-      </w:r>
-      <w:proofErr w:type="spellStart"/>
-      <w:r>
-        <w:rPr>
-          <w:rFonts w:cstheme="minorHAnsi"/>
-          <w:i/>
-          <w:color w:val="FF0000"/>
-          <w:sz w:val="26"/>
-          <w:szCs w:val="26"/>
-        </w:rPr>
-        <w:t>dụng</w:t>
-      </w:r>
-      <w:proofErr w:type="spellEnd"/>
-      <w:r>
-        <w:rPr>
-          <w:rFonts w:cstheme="minorHAnsi"/>
-          <w:i/>
-          <w:color w:val="FF0000"/>
-          <w:sz w:val="26"/>
-          <w:szCs w:val="26"/>
-        </w:rPr>
-        <w:t xml:space="preserve"> (jQuery), </w:t>
-      </w:r>
-      <w:proofErr w:type="spellStart"/>
-      <w:r>
-        <w:rPr>
-          <w:rFonts w:cstheme="minorHAnsi"/>
-          <w:i/>
-          <w:color w:val="FF0000"/>
-          <w:sz w:val="26"/>
-          <w:szCs w:val="26"/>
-        </w:rPr>
-        <w:t>nguồn</w:t>
-      </w:r>
-      <w:proofErr w:type="spellEnd"/>
-      <w:r>
-        <w:rPr>
-          <w:rFonts w:cstheme="minorHAnsi"/>
-          <w:i/>
-          <w:color w:val="FF0000"/>
-          <w:sz w:val="26"/>
-          <w:szCs w:val="26"/>
-        </w:rPr>
-        <w:t xml:space="preserve"> </w:t>
-      </w:r>
-      <w:proofErr w:type="spellStart"/>
-      <w:r>
-        <w:rPr>
-          <w:rFonts w:cstheme="minorHAnsi"/>
-          <w:i/>
-          <w:color w:val="FF0000"/>
-          <w:sz w:val="26"/>
-          <w:szCs w:val="26"/>
-        </w:rPr>
-        <w:t>gốc</w:t>
-      </w:r>
-      <w:proofErr w:type="spellEnd"/>
     </w:p>
     <w:p>
       <w:pPr>
@@ -4717,7 +3338,6 @@
           <w:szCs w:val="26"/>
         </w:rPr>
       </w:pPr>
-      <w:proofErr w:type="spellStart"/>
       <w:r>
         <w:rPr>
           <w:rFonts w:cstheme="minorHAnsi"/>
@@ -4726,9 +3346,19 @@
           <w:sz w:val="26"/>
           <w:szCs w:val="26"/>
         </w:rPr>
-        <w:t>Vẽ</w:t>
+        <w:t xml:space="preserve">Vẽ layout của từng trang </w:t>
       </w:r>
-      <w:proofErr w:type="spellEnd"/>
+    </w:p>
+    <w:p>
+      <w:pPr>
+        <w:rPr>
+          <w:rFonts w:cstheme="minorHAnsi"/>
+          <w:i/>
+          <w:color w:val="FF0000"/>
+          <w:sz w:val="26"/>
+          <w:szCs w:val="26"/>
+        </w:rPr>
+      </w:pPr>
       <w:r>
         <w:rPr>
           <w:rFonts w:cstheme="minorHAnsi"/>
@@ -4737,270 +3367,7 @@
           <w:sz w:val="26"/>
           <w:szCs w:val="26"/>
         </w:rPr>
-        <w:t xml:space="preserve"> layout </w:t>
-      </w:r>
-      <w:proofErr w:type="spellStart"/>
-      <w:r>
-        <w:rPr>
-          <w:rFonts w:cstheme="minorHAnsi"/>
-          <w:i/>
-          <w:color w:val="FF0000"/>
-          <w:sz w:val="26"/>
-          <w:szCs w:val="26"/>
-        </w:rPr>
-        <w:t>của</w:t>
-      </w:r>
-      <w:proofErr w:type="spellEnd"/>
-      <w:r>
-        <w:rPr>
-          <w:rFonts w:cstheme="minorHAnsi"/>
-          <w:i/>
-          <w:color w:val="FF0000"/>
-          <w:sz w:val="26"/>
-          <w:szCs w:val="26"/>
-        </w:rPr>
-        <w:t xml:space="preserve"> </w:t>
-      </w:r>
-      <w:proofErr w:type="spellStart"/>
-      <w:r>
-        <w:rPr>
-          <w:rFonts w:cstheme="minorHAnsi"/>
-          <w:i/>
-          <w:color w:val="FF0000"/>
-          <w:sz w:val="26"/>
-          <w:szCs w:val="26"/>
-        </w:rPr>
-        <w:t>từng</w:t>
-      </w:r>
-      <w:proofErr w:type="spellEnd"/>
-      <w:r>
-        <w:rPr>
-          <w:rFonts w:cstheme="minorHAnsi"/>
-          <w:i/>
-          <w:color w:val="FF0000"/>
-          <w:sz w:val="26"/>
-          <w:szCs w:val="26"/>
-        </w:rPr>
-        <w:t xml:space="preserve"> </w:t>
-      </w:r>
-      <w:proofErr w:type="spellStart"/>
-      <w:r>
-        <w:rPr>
-          <w:rFonts w:cstheme="minorHAnsi"/>
-          <w:i/>
-          <w:color w:val="FF0000"/>
-          <w:sz w:val="26"/>
-          <w:szCs w:val="26"/>
-        </w:rPr>
-        <w:t>trang</w:t>
-      </w:r>
-      <w:proofErr w:type="spellEnd"/>
-      <w:r>
-        <w:rPr>
-          <w:rFonts w:cstheme="minorHAnsi"/>
-          <w:i/>
-          <w:color w:val="FF0000"/>
-          <w:sz w:val="26"/>
-          <w:szCs w:val="26"/>
-        </w:rPr>
-        <w:t xml:space="preserve"> </w:t>
-      </w:r>
-    </w:p>
-    <w:p>
-      <w:pPr>
-        <w:rPr>
-          <w:rFonts w:cstheme="minorHAnsi"/>
-          <w:i/>
-          <w:color w:val="FF0000"/>
-          <w:sz w:val="26"/>
-          <w:szCs w:val="26"/>
-        </w:rPr>
-      </w:pPr>
-      <w:r>
-        <w:rPr>
-          <w:rFonts w:cstheme="minorHAnsi"/>
-          <w:i/>
-          <w:color w:val="FF0000"/>
-          <w:sz w:val="26"/>
-          <w:szCs w:val="26"/>
-        </w:rPr>
-        <w:t xml:space="preserve">Các </w:t>
-      </w:r>
-      <w:proofErr w:type="spellStart"/>
-      <w:r>
-        <w:rPr>
-          <w:rFonts w:cstheme="minorHAnsi"/>
-          <w:i/>
-          <w:color w:val="FF0000"/>
-          <w:sz w:val="26"/>
-          <w:szCs w:val="26"/>
-        </w:rPr>
-        <w:t>nội</w:t>
-      </w:r>
-      <w:proofErr w:type="spellEnd"/>
-      <w:r>
-        <w:rPr>
-          <w:rFonts w:cstheme="minorHAnsi"/>
-          <w:i/>
-          <w:color w:val="FF0000"/>
-          <w:sz w:val="26"/>
-          <w:szCs w:val="26"/>
-        </w:rPr>
-        <w:t xml:space="preserve"> dung </w:t>
-      </w:r>
-      <w:proofErr w:type="spellStart"/>
-      <w:r>
-        <w:rPr>
-          <w:rFonts w:cstheme="minorHAnsi"/>
-          <w:i/>
-          <w:color w:val="FF0000"/>
-          <w:sz w:val="26"/>
-          <w:szCs w:val="26"/>
-        </w:rPr>
-        <w:t>sẽ</w:t>
-      </w:r>
-      <w:proofErr w:type="spellEnd"/>
-      <w:r>
-        <w:rPr>
-          <w:rFonts w:cstheme="minorHAnsi"/>
-          <w:i/>
-          <w:color w:val="FF0000"/>
-          <w:sz w:val="26"/>
-          <w:szCs w:val="26"/>
-        </w:rPr>
-        <w:t xml:space="preserve"> </w:t>
-      </w:r>
-      <w:proofErr w:type="spellStart"/>
-      <w:r>
-        <w:rPr>
-          <w:rFonts w:cstheme="minorHAnsi"/>
-          <w:i/>
-          <w:color w:val="FF0000"/>
-          <w:sz w:val="26"/>
-          <w:szCs w:val="26"/>
-        </w:rPr>
-        <w:t>có</w:t>
-      </w:r>
-      <w:proofErr w:type="spellEnd"/>
-      <w:r>
-        <w:rPr>
-          <w:rFonts w:cstheme="minorHAnsi"/>
-          <w:i/>
-          <w:color w:val="FF0000"/>
-          <w:sz w:val="26"/>
-          <w:szCs w:val="26"/>
-        </w:rPr>
-        <w:t xml:space="preserve"> </w:t>
-      </w:r>
-      <w:proofErr w:type="spellStart"/>
-      <w:r>
-        <w:rPr>
-          <w:rFonts w:cstheme="minorHAnsi"/>
-          <w:i/>
-          <w:color w:val="FF0000"/>
-          <w:sz w:val="26"/>
-          <w:szCs w:val="26"/>
-        </w:rPr>
-        <w:t>trên</w:t>
-      </w:r>
-      <w:proofErr w:type="spellEnd"/>
-      <w:r>
-        <w:rPr>
-          <w:rFonts w:cstheme="minorHAnsi"/>
-          <w:i/>
-          <w:color w:val="FF0000"/>
-          <w:sz w:val="26"/>
-          <w:szCs w:val="26"/>
-        </w:rPr>
-        <w:t xml:space="preserve"> </w:t>
-      </w:r>
-      <w:proofErr w:type="spellStart"/>
-      <w:r>
-        <w:rPr>
-          <w:rFonts w:cstheme="minorHAnsi"/>
-          <w:i/>
-          <w:color w:val="FF0000"/>
-          <w:sz w:val="26"/>
-          <w:szCs w:val="26"/>
-        </w:rPr>
-        <w:t>mỗi</w:t>
-      </w:r>
-      <w:proofErr w:type="spellEnd"/>
-      <w:r>
-        <w:rPr>
-          <w:rFonts w:cstheme="minorHAnsi"/>
-          <w:i/>
-          <w:color w:val="FF0000"/>
-          <w:sz w:val="26"/>
-          <w:szCs w:val="26"/>
-        </w:rPr>
-        <w:t xml:space="preserve"> </w:t>
-      </w:r>
-      <w:proofErr w:type="spellStart"/>
-      <w:r>
-        <w:rPr>
-          <w:rFonts w:cstheme="minorHAnsi"/>
-          <w:i/>
-          <w:color w:val="FF0000"/>
-          <w:sz w:val="26"/>
-          <w:szCs w:val="26"/>
-        </w:rPr>
-        <w:t>thành</w:t>
-      </w:r>
-      <w:proofErr w:type="spellEnd"/>
-      <w:r>
-        <w:rPr>
-          <w:rFonts w:cstheme="minorHAnsi"/>
-          <w:i/>
-          <w:color w:val="FF0000"/>
-          <w:sz w:val="26"/>
-          <w:szCs w:val="26"/>
-        </w:rPr>
-        <w:t xml:space="preserve"> </w:t>
-      </w:r>
-      <w:proofErr w:type="spellStart"/>
-      <w:r>
-        <w:rPr>
-          <w:rFonts w:cstheme="minorHAnsi"/>
-          <w:i/>
-          <w:color w:val="FF0000"/>
-          <w:sz w:val="26"/>
-          <w:szCs w:val="26"/>
-        </w:rPr>
-        <w:t>phần</w:t>
-      </w:r>
-      <w:proofErr w:type="spellEnd"/>
-      <w:r>
-        <w:rPr>
-          <w:rFonts w:cstheme="minorHAnsi"/>
-          <w:i/>
-          <w:color w:val="FF0000"/>
-          <w:sz w:val="26"/>
-          <w:szCs w:val="26"/>
-        </w:rPr>
-        <w:t xml:space="preserve"> </w:t>
-      </w:r>
-      <w:proofErr w:type="spellStart"/>
-      <w:r>
-        <w:rPr>
-          <w:rFonts w:cstheme="minorHAnsi"/>
-          <w:i/>
-          <w:color w:val="FF0000"/>
-          <w:sz w:val="26"/>
-          <w:szCs w:val="26"/>
-        </w:rPr>
-        <w:t>của</w:t>
-      </w:r>
-      <w:proofErr w:type="spellEnd"/>
-      <w:r>
-        <w:rPr>
-          <w:rFonts w:cstheme="minorHAnsi"/>
-          <w:i/>
-          <w:color w:val="FF0000"/>
-          <w:sz w:val="26"/>
-          <w:szCs w:val="26"/>
-        </w:rPr>
-        <w:t xml:space="preserve"> </w:t>
+        <w:t>Các nội dung sẽ</w:t>
       </w:r>
       <w:r>
         <w:rPr>
@@ -5010,9 +3377,8 @@
           <w:sz w:val="26"/>
           <w:szCs w:val="26"/>
         </w:rPr>
-        <w:t xml:space="preserve">layout </w:t>
+        <w:t xml:space="preserve"> có</w:t>
       </w:r>
-      <w:proofErr w:type="spellStart"/>
       <w:r>
         <w:rPr>
           <w:rFonts w:cstheme="minorHAnsi"/>
@@ -5021,9 +3387,8 @@
           <w:sz w:val="26"/>
           <w:szCs w:val="26"/>
         </w:rPr>
-        <w:t>như</w:t>
+        <w:t xml:space="preserve"> trên mỗi thành phần của </w:t>
       </w:r>
-      <w:proofErr w:type="spellEnd"/>
       <w:r>
         <w:rPr>
           <w:rFonts w:cstheme="minorHAnsi"/>
@@ -5032,51 +3397,7 @@
           <w:sz w:val="26"/>
           <w:szCs w:val="26"/>
         </w:rPr>
-        <w:t xml:space="preserve"> form, </w:t>
-      </w:r>
-      <w:proofErr w:type="spellStart"/>
-      <w:r>
-        <w:rPr>
-          <w:rFonts w:cstheme="minorHAnsi"/>
-          <w:i/>
-          <w:color w:val="FF0000"/>
-          <w:sz w:val="26"/>
-          <w:szCs w:val="26"/>
-        </w:rPr>
-        <w:t>liên</w:t>
-      </w:r>
-      <w:proofErr w:type="spellEnd"/>
-      <w:r>
-        <w:rPr>
-          <w:rFonts w:cstheme="minorHAnsi"/>
-          <w:i/>
-          <w:color w:val="FF0000"/>
-          <w:sz w:val="26"/>
-          <w:szCs w:val="26"/>
-        </w:rPr>
-        <w:t xml:space="preserve"> </w:t>
-      </w:r>
-      <w:proofErr w:type="spellStart"/>
-      <w:r>
-        <w:rPr>
-          <w:rFonts w:cstheme="minorHAnsi"/>
-          <w:i/>
-          <w:color w:val="FF0000"/>
-          <w:sz w:val="26"/>
-          <w:szCs w:val="26"/>
-        </w:rPr>
-        <w:t>kết</w:t>
-      </w:r>
-      <w:proofErr w:type="spellEnd"/>
-      <w:r>
-        <w:rPr>
-          <w:rFonts w:cstheme="minorHAnsi"/>
-          <w:i/>
-          <w:color w:val="FF0000"/>
-          <w:sz w:val="26"/>
-          <w:szCs w:val="26"/>
-        </w:rPr>
-        <w:t>, menu, table, ….</w:t>
+        <w:t>layout như form, liên kết, menu, table, ….</w:t>
       </w:r>
       <w:r>
         <w:rPr>
@@ -5107,183 +3428,7 @@
           <w:sz w:val="26"/>
           <w:szCs w:val="26"/>
         </w:rPr>
-        <w:t xml:space="preserve">Ý </w:t>
-      </w:r>
-      <w:proofErr w:type="spellStart"/>
-      <w:r>
-        <w:rPr>
-          <w:rFonts w:cstheme="minorHAnsi"/>
-          <w:i/>
-          <w:color w:val="FF0000"/>
-          <w:sz w:val="26"/>
-          <w:szCs w:val="26"/>
-        </w:rPr>
-        <w:t>nghĩa</w:t>
-      </w:r>
-      <w:proofErr w:type="spellEnd"/>
-      <w:r>
-        <w:rPr>
-          <w:rFonts w:cstheme="minorHAnsi"/>
-          <w:i/>
-          <w:color w:val="FF0000"/>
-          <w:sz w:val="26"/>
-          <w:szCs w:val="26"/>
-        </w:rPr>
-        <w:t xml:space="preserve">, </w:t>
-      </w:r>
-      <w:proofErr w:type="spellStart"/>
-      <w:r>
-        <w:rPr>
-          <w:rFonts w:cstheme="minorHAnsi"/>
-          <w:i/>
-          <w:color w:val="FF0000"/>
-          <w:sz w:val="26"/>
-          <w:szCs w:val="26"/>
-        </w:rPr>
-        <w:t>mục</w:t>
-      </w:r>
-      <w:proofErr w:type="spellEnd"/>
-      <w:r>
-        <w:rPr>
-          <w:rFonts w:cstheme="minorHAnsi"/>
-          <w:i/>
-          <w:color w:val="FF0000"/>
-          <w:sz w:val="26"/>
-          <w:szCs w:val="26"/>
-        </w:rPr>
-        <w:t xml:space="preserve"> </w:t>
-      </w:r>
-      <w:proofErr w:type="spellStart"/>
-      <w:r>
-        <w:rPr>
-          <w:rFonts w:cstheme="minorHAnsi"/>
-          <w:i/>
-          <w:color w:val="FF0000"/>
-          <w:sz w:val="26"/>
-          <w:szCs w:val="26"/>
-        </w:rPr>
-        <w:t>đích</w:t>
-      </w:r>
-      <w:proofErr w:type="spellEnd"/>
-      <w:r>
-        <w:rPr>
-          <w:rFonts w:cstheme="minorHAnsi"/>
-          <w:i/>
-          <w:color w:val="FF0000"/>
-          <w:sz w:val="26"/>
-          <w:szCs w:val="26"/>
-        </w:rPr>
-        <w:t xml:space="preserve"> </w:t>
-      </w:r>
-      <w:proofErr w:type="spellStart"/>
-      <w:r>
-        <w:rPr>
-          <w:rFonts w:cstheme="minorHAnsi"/>
-          <w:i/>
-          <w:color w:val="FF0000"/>
-          <w:sz w:val="26"/>
-          <w:szCs w:val="26"/>
-        </w:rPr>
-        <w:t>thực</w:t>
-      </w:r>
-      <w:proofErr w:type="spellEnd"/>
-      <w:r>
-        <w:rPr>
-          <w:rFonts w:cstheme="minorHAnsi"/>
-          <w:i/>
-          <w:color w:val="FF0000"/>
-          <w:sz w:val="26"/>
-          <w:szCs w:val="26"/>
-        </w:rPr>
-        <w:t xml:space="preserve"> </w:t>
-      </w:r>
-      <w:proofErr w:type="spellStart"/>
-      <w:r>
-        <w:rPr>
-          <w:rFonts w:cstheme="minorHAnsi"/>
-          <w:i/>
-          <w:color w:val="FF0000"/>
-          <w:sz w:val="26"/>
-          <w:szCs w:val="26"/>
-        </w:rPr>
-        <w:t>hiện</w:t>
-      </w:r>
-      <w:proofErr w:type="spellEnd"/>
-      <w:r>
-        <w:rPr>
-          <w:rFonts w:cstheme="minorHAnsi"/>
-          <w:i/>
-          <w:color w:val="FF0000"/>
-          <w:sz w:val="26"/>
-          <w:szCs w:val="26"/>
-        </w:rPr>
-        <w:t xml:space="preserve"> </w:t>
-      </w:r>
-      <w:proofErr w:type="spellStart"/>
-      <w:r>
-        <w:rPr>
-          <w:rFonts w:cstheme="minorHAnsi"/>
-          <w:i/>
-          <w:color w:val="FF0000"/>
-          <w:sz w:val="26"/>
-          <w:szCs w:val="26"/>
-        </w:rPr>
-        <w:t>của</w:t>
-      </w:r>
-      <w:proofErr w:type="spellEnd"/>
-      <w:r>
-        <w:rPr>
-          <w:rFonts w:cstheme="minorHAnsi"/>
-          <w:i/>
-          <w:color w:val="FF0000"/>
-          <w:sz w:val="26"/>
-          <w:szCs w:val="26"/>
-        </w:rPr>
-        <w:t xml:space="preserve"> </w:t>
-      </w:r>
-      <w:proofErr w:type="spellStart"/>
-      <w:r>
-        <w:rPr>
-          <w:rFonts w:cstheme="minorHAnsi"/>
-          <w:i/>
-          <w:color w:val="FF0000"/>
-          <w:sz w:val="26"/>
-          <w:szCs w:val="26"/>
-        </w:rPr>
-        <w:t>mỗi</w:t>
-      </w:r>
-      <w:proofErr w:type="spellEnd"/>
-      <w:r>
-        <w:rPr>
-          <w:rFonts w:cstheme="minorHAnsi"/>
-          <w:i/>
-          <w:color w:val="FF0000"/>
-          <w:sz w:val="26"/>
-          <w:szCs w:val="26"/>
-        </w:rPr>
-        <w:t xml:space="preserve"> </w:t>
-      </w:r>
-      <w:proofErr w:type="spellStart"/>
-      <w:r>
-        <w:rPr>
-          <w:rFonts w:cstheme="minorHAnsi"/>
-          <w:i/>
-          <w:color w:val="FF0000"/>
-          <w:sz w:val="26"/>
-          <w:szCs w:val="26"/>
-        </w:rPr>
-        <w:t>nội</w:t>
-      </w:r>
-      <w:proofErr w:type="spellEnd"/>
-      <w:r>
-        <w:rPr>
-          <w:rFonts w:cstheme="minorHAnsi"/>
-          <w:i/>
-          <w:color w:val="FF0000"/>
-          <w:sz w:val="26"/>
-          <w:szCs w:val="26"/>
-        </w:rPr>
-        <w:t xml:space="preserve"> dung …</w:t>
+        <w:t>Ý nghĩa, mục đích thực hiện của mỗi nội dung …</w:t>
       </w:r>
     </w:p>
     <w:p>
@@ -5291,21 +3436,8 @@
         <w:pStyle w:val="Heading3"/>
       </w:pPr>
       <w:r>
-        <w:t xml:space="preserve">Trang </w:t>
+        <w:t>Trang đăng nhập</w:t>
       </w:r>
-      <w:proofErr w:type="spellStart"/>
-      <w:r>
-        <w:t>đăng</w:t>
-      </w:r>
-      <w:proofErr w:type="spellEnd"/>
-      <w:r>
-        <w:t xml:space="preserve"> </w:t>
-      </w:r>
-      <w:proofErr w:type="spellStart"/>
-      <w:r>
-        <w:t>nhập</w:t>
-      </w:r>
-      <w:proofErr w:type="spellEnd"/>
     </w:p>
     <w:p>
       <w:pPr>
@@ -5313,46 +3445,6 @@
           <w:rFonts w:ascii="Times New Roman" w:hAnsi="Times New Roman" w:cs="Times New Roman"/>
         </w:rPr>
       </w:pPr>
-      <w:r>
-        <w:rPr>
-          <w:noProof/>
-        </w:rPr>
-        <w:drawing>
-          <wp:inline distT="0" distB="0" distL="0" distR="0" wp14:anchorId="454217A1" wp14:editId="2D11A032">
-            <wp:extent cx="6511925" cy="3144520"/>
-            <wp:effectExtent l="0" t="0" r="3175" b="0"/>
-            <wp:docPr id="3" name="Picture 3"/>
-            <wp:cNvGraphicFramePr>
-              <a:graphicFrameLocks xmlns:a="http://schemas.openxmlformats.org/drawingml/2006/main" noChangeAspect="1"/>
-            </wp:cNvGraphicFramePr>
-            <a:graphic xmlns:a="http://schemas.openxmlformats.org/drawingml/2006/main">
-              <a:graphicData uri="http://schemas.openxmlformats.org/drawingml/2006/picture">
-                <pic:pic xmlns:pic="http://schemas.openxmlformats.org/drawingml/2006/picture">
-                  <pic:nvPicPr>
-                    <pic:cNvPr id="1" name=""/>
-                    <pic:cNvPicPr/>
-                  </pic:nvPicPr>
-                  <pic:blipFill>
-                    <a:blip r:embed="rId11"/>
-                    <a:stretch>
-                      <a:fillRect/>
-                    </a:stretch>
-                  </pic:blipFill>
-                  <pic:spPr>
-                    <a:xfrm>
-                      <a:off x="0" y="0"/>
-                      <a:ext cx="6511925" cy="3144520"/>
-                    </a:xfrm>
-                    <a:prstGeom prst="rect">
-                      <a:avLst/>
-                    </a:prstGeom>
-                  </pic:spPr>
-                </pic:pic>
-              </a:graphicData>
-            </a:graphic>
-          </wp:inline>
-        </w:drawing>
-      </w:r>
     </w:p>
     <w:p>
       <w:pPr>
@@ -5362,7 +3454,6 @@
           <w:szCs w:val="26"/>
         </w:rPr>
       </w:pPr>
-      <w:proofErr w:type="spellStart"/>
       <w:r>
         <w:rPr>
           <w:rFonts w:ascii="Times New Roman" w:hAnsi="Times New Roman" w:cs="Times New Roman"/>
@@ -5370,69 +3461,8 @@
           <w:sz w:val="26"/>
           <w:szCs w:val="26"/>
         </w:rPr>
-        <w:t>Đăng</w:t>
+        <w:t>Đăng nhập, đăng ký</w:t>
       </w:r>
-      <w:proofErr w:type="spellEnd"/>
-      <w:r>
-        <w:rPr>
-          <w:rFonts w:ascii="Times New Roman" w:hAnsi="Times New Roman" w:cs="Times New Roman"/>
-          <w:b/>
-          <w:sz w:val="26"/>
-          <w:szCs w:val="26"/>
-        </w:rPr>
-        <w:t xml:space="preserve"> </w:t>
-      </w:r>
-      <w:proofErr w:type="spellStart"/>
-      <w:r>
-        <w:rPr>
-          <w:rFonts w:ascii="Times New Roman" w:hAnsi="Times New Roman" w:cs="Times New Roman"/>
-          <w:b/>
-          <w:sz w:val="26"/>
-          <w:szCs w:val="26"/>
-        </w:rPr>
-        <w:t>nhập</w:t>
-      </w:r>
-      <w:proofErr w:type="spellEnd"/>
-      <w:r>
-        <w:rPr>
-          <w:rFonts w:ascii="Times New Roman" w:hAnsi="Times New Roman" w:cs="Times New Roman"/>
-          <w:b/>
-          <w:sz w:val="26"/>
-          <w:szCs w:val="26"/>
-        </w:rPr>
-        <w:t xml:space="preserve">, </w:t>
-      </w:r>
-      <w:proofErr w:type="spellStart"/>
-      <w:r>
-        <w:rPr>
-          <w:rFonts w:ascii="Times New Roman" w:hAnsi="Times New Roman" w:cs="Times New Roman"/>
-          <w:b/>
-          <w:sz w:val="26"/>
-          <w:szCs w:val="26"/>
-        </w:rPr>
-        <w:t>đăng</w:t>
-      </w:r>
-      <w:proofErr w:type="spellEnd"/>
-      <w:r>
-        <w:rPr>
-          <w:rFonts w:ascii="Times New Roman" w:hAnsi="Times New Roman" w:cs="Times New Roman"/>
-          <w:b/>
-          <w:sz w:val="26"/>
-          <w:szCs w:val="26"/>
-        </w:rPr>
-        <w:t xml:space="preserve"> </w:t>
-      </w:r>
-      <w:proofErr w:type="spellStart"/>
-      <w:r>
-        <w:rPr>
-          <w:rFonts w:ascii="Times New Roman" w:hAnsi="Times New Roman" w:cs="Times New Roman"/>
-          <w:b/>
-          <w:sz w:val="26"/>
-          <w:szCs w:val="26"/>
-        </w:rPr>
-        <w:t>ký</w:t>
-      </w:r>
-      <w:proofErr w:type="spellEnd"/>
       <w:r>
         <w:rPr>
           <w:rFonts w:ascii="Times New Roman" w:hAnsi="Times New Roman" w:cs="Times New Roman"/>
@@ -5448,25 +3478,7 @@
           <w:sz w:val="26"/>
           <w:szCs w:val="26"/>
         </w:rPr>
-        <w:t xml:space="preserve"> </w:t>
-      </w:r>
-      <w:proofErr w:type="spellStart"/>
-      <w:r>
-        <w:rPr>
-          <w:rFonts w:ascii="Times New Roman" w:hAnsi="Times New Roman" w:cs="Times New Roman"/>
-          <w:sz w:val="26"/>
-          <w:szCs w:val="26"/>
-        </w:rPr>
-        <w:t>chứa</w:t>
-      </w:r>
-      <w:proofErr w:type="spellEnd"/>
-      <w:r>
-        <w:rPr>
-          <w:rFonts w:ascii="Times New Roman" w:hAnsi="Times New Roman" w:cs="Times New Roman"/>
-          <w:sz w:val="26"/>
-          <w:szCs w:val="26"/>
-        </w:rPr>
-        <w:t xml:space="preserve"> </w:t>
+        <w:t xml:space="preserve"> chứa </w:t>
       </w:r>
       <w:r>
         <w:rPr>
@@ -5474,79 +3486,7 @@
           <w:sz w:val="26"/>
           <w:szCs w:val="26"/>
         </w:rPr>
-        <w:t xml:space="preserve">username, password, button </w:t>
-      </w:r>
-      <w:proofErr w:type="spellStart"/>
-      <w:r>
-        <w:rPr>
-          <w:rFonts w:ascii="Times New Roman" w:hAnsi="Times New Roman" w:cs="Times New Roman"/>
-          <w:sz w:val="26"/>
-          <w:szCs w:val="26"/>
-        </w:rPr>
-        <w:t>đăng</w:t>
-      </w:r>
-      <w:proofErr w:type="spellEnd"/>
-      <w:r>
-        <w:rPr>
-          <w:rFonts w:ascii="Times New Roman" w:hAnsi="Times New Roman" w:cs="Times New Roman"/>
-          <w:sz w:val="26"/>
-          <w:szCs w:val="26"/>
-        </w:rPr>
-        <w:t xml:space="preserve"> </w:t>
-      </w:r>
-      <w:proofErr w:type="spellStart"/>
-      <w:r>
-        <w:rPr>
-          <w:rFonts w:ascii="Times New Roman" w:hAnsi="Times New Roman" w:cs="Times New Roman"/>
-          <w:sz w:val="26"/>
-          <w:szCs w:val="26"/>
-        </w:rPr>
-        <w:t>nhập</w:t>
-      </w:r>
-      <w:proofErr w:type="spellEnd"/>
-      <w:r>
-        <w:rPr>
-          <w:rFonts w:ascii="Times New Roman" w:hAnsi="Times New Roman" w:cs="Times New Roman"/>
-          <w:sz w:val="26"/>
-          <w:szCs w:val="26"/>
-        </w:rPr>
-        <w:t xml:space="preserve">, button </w:t>
-      </w:r>
-      <w:proofErr w:type="spellStart"/>
-      <w:r>
-        <w:rPr>
-          <w:rFonts w:ascii="Times New Roman" w:hAnsi="Times New Roman" w:cs="Times New Roman"/>
-          <w:sz w:val="26"/>
-          <w:szCs w:val="26"/>
-        </w:rPr>
-        <w:t>đăng</w:t>
-      </w:r>
-      <w:proofErr w:type="spellEnd"/>
-      <w:r>
-        <w:rPr>
-          <w:rFonts w:ascii="Times New Roman" w:hAnsi="Times New Roman" w:cs="Times New Roman"/>
-          <w:sz w:val="26"/>
-          <w:szCs w:val="26"/>
-        </w:rPr>
-        <w:t xml:space="preserve"> </w:t>
-      </w:r>
-      <w:proofErr w:type="spellStart"/>
-      <w:r>
-        <w:rPr>
-          <w:rFonts w:ascii="Times New Roman" w:hAnsi="Times New Roman" w:cs="Times New Roman"/>
-          <w:sz w:val="26"/>
-          <w:szCs w:val="26"/>
-        </w:rPr>
-        <w:t>ký</w:t>
-      </w:r>
-      <w:proofErr w:type="spellEnd"/>
-      <w:r>
-        <w:rPr>
-          <w:rFonts w:ascii="Times New Roman" w:hAnsi="Times New Roman" w:cs="Times New Roman"/>
-          <w:sz w:val="26"/>
-          <w:szCs w:val="26"/>
-        </w:rPr>
-        <w:t>.</w:t>
+        <w:t>username, password, button đăng nhập, button đăng ký.</w:t>
       </w:r>
     </w:p>
     <w:p>
@@ -5572,21 +3512,11 @@
       </w:pPr>
       <w:r>
         <w:lastRenderedPageBreak/>
-        <w:t xml:space="preserve">Trang </w:t>
+        <w:t xml:space="preserve">Trang đăng </w:t>
       </w:r>
-      <w:proofErr w:type="spellStart"/>
-      <w:r>
-        <w:t>đăng</w:t>
-      </w:r>
-      <w:proofErr w:type="spellEnd"/>
-      <w:r>
-        <w:t xml:space="preserve"> </w:t>
-      </w:r>
-      <w:proofErr w:type="spellStart"/>
       <w:r>
         <w:t>ký</w:t>
       </w:r>
-      <w:proofErr w:type="spellEnd"/>
     </w:p>
     <w:p>
       <w:pPr>
@@ -5596,46 +3526,6 @@
           <w:szCs w:val="26"/>
         </w:rPr>
       </w:pPr>
-      <w:r>
-        <w:rPr>
-          <w:noProof/>
-        </w:rPr>
-        <w:drawing>
-          <wp:inline distT="0" distB="0" distL="0" distR="0" wp14:anchorId="75ADEB6F" wp14:editId="78528630">
-            <wp:extent cx="6511925" cy="3167380"/>
-            <wp:effectExtent l="0" t="0" r="3175" b="0"/>
-            <wp:docPr id="5" name="Picture 5"/>
-            <wp:cNvGraphicFramePr>
-              <a:graphicFrameLocks xmlns:a="http://schemas.openxmlformats.org/drawingml/2006/main" noChangeAspect="1"/>
-            </wp:cNvGraphicFramePr>
-            <a:graphic xmlns:a="http://schemas.openxmlformats.org/drawingml/2006/main">
-              <a:graphicData uri="http://schemas.openxmlformats.org/drawingml/2006/picture">
-                <pic:pic xmlns:pic="http://schemas.openxmlformats.org/drawingml/2006/picture">
-                  <pic:nvPicPr>
-                    <pic:cNvPr id="1" name=""/>
-                    <pic:cNvPicPr/>
-                  </pic:nvPicPr>
-                  <pic:blipFill>
-                    <a:blip r:embed="rId12"/>
-                    <a:stretch>
-                      <a:fillRect/>
-                    </a:stretch>
-                  </pic:blipFill>
-                  <pic:spPr>
-                    <a:xfrm>
-                      <a:off x="0" y="0"/>
-                      <a:ext cx="6511925" cy="3167380"/>
-                    </a:xfrm>
-                    <a:prstGeom prst="rect">
-                      <a:avLst/>
-                    </a:prstGeom>
-                  </pic:spPr>
-                </pic:pic>
-              </a:graphicData>
-            </a:graphic>
-          </wp:inline>
-        </w:drawing>
-      </w:r>
     </w:p>
     <w:p>
       <w:pPr>
@@ -5662,52 +3552,14 @@
         </w:rPr>
         <w:t xml:space="preserve">: </w:t>
       </w:r>
-      <w:proofErr w:type="spellStart"/>
       <w:r>
         <w:rPr>
           <w:rFonts w:ascii="Times New Roman" w:hAnsi="Times New Roman" w:cs="Times New Roman"/>
           <w:sz w:val="26"/>
           <w:szCs w:val="26"/>
         </w:rPr>
-        <w:t>chứa</w:t>
+        <w:t>chứa button đăng nhập</w:t>
       </w:r>
-      <w:proofErr w:type="spellEnd"/>
-      <w:r>
-        <w:rPr>
-          <w:rFonts w:ascii="Times New Roman" w:hAnsi="Times New Roman" w:cs="Times New Roman"/>
-          <w:sz w:val="26"/>
-          <w:szCs w:val="26"/>
-        </w:rPr>
-        <w:t xml:space="preserve"> button </w:t>
-      </w:r>
-      <w:proofErr w:type="spellStart"/>
-      <w:r>
-        <w:rPr>
-          <w:rFonts w:ascii="Times New Roman" w:hAnsi="Times New Roman" w:cs="Times New Roman"/>
-          <w:sz w:val="26"/>
-          <w:szCs w:val="26"/>
-        </w:rPr>
-        <w:t>đăng</w:t>
-      </w:r>
-      <w:proofErr w:type="spellEnd"/>
-      <w:r>
-        <w:rPr>
-          <w:rFonts w:ascii="Times New Roman" w:hAnsi="Times New Roman" w:cs="Times New Roman"/>
-          <w:sz w:val="26"/>
-          <w:szCs w:val="26"/>
-        </w:rPr>
-        <w:t xml:space="preserve"> </w:t>
-      </w:r>
-      <w:proofErr w:type="spellStart"/>
-      <w:r>
-        <w:rPr>
-          <w:rFonts w:ascii="Times New Roman" w:hAnsi="Times New Roman" w:cs="Times New Roman"/>
-          <w:sz w:val="26"/>
-          <w:szCs w:val="26"/>
-        </w:rPr>
-        <w:t>nhập</w:t>
-      </w:r>
-      <w:proofErr w:type="spellEnd"/>
     </w:p>
     <w:p>
       <w:pPr>
@@ -5732,421 +3584,7 @@
           <w:sz w:val="26"/>
           <w:szCs w:val="26"/>
         </w:rPr>
-        <w:t xml:space="preserve">: form </w:t>
-      </w:r>
-      <w:proofErr w:type="spellStart"/>
-      <w:r>
-        <w:rPr>
-          <w:rFonts w:ascii="Times New Roman" w:hAnsi="Times New Roman" w:cs="Times New Roman"/>
-          <w:sz w:val="26"/>
-          <w:szCs w:val="26"/>
-        </w:rPr>
-        <w:t>đăng</w:t>
-      </w:r>
-      <w:proofErr w:type="spellEnd"/>
-      <w:r>
-        <w:rPr>
-          <w:rFonts w:ascii="Times New Roman" w:hAnsi="Times New Roman" w:cs="Times New Roman"/>
-          <w:sz w:val="26"/>
-          <w:szCs w:val="26"/>
-        </w:rPr>
-        <w:t xml:space="preserve"> </w:t>
-      </w:r>
-      <w:proofErr w:type="spellStart"/>
-      <w:r>
-        <w:rPr>
-          <w:rFonts w:ascii="Times New Roman" w:hAnsi="Times New Roman" w:cs="Times New Roman"/>
-          <w:sz w:val="26"/>
-          <w:szCs w:val="26"/>
-        </w:rPr>
-        <w:t>ký</w:t>
-      </w:r>
-      <w:proofErr w:type="spellEnd"/>
-      <w:r>
-        <w:rPr>
-          <w:rFonts w:ascii="Times New Roman" w:hAnsi="Times New Roman" w:cs="Times New Roman"/>
-          <w:sz w:val="26"/>
-          <w:szCs w:val="26"/>
-        </w:rPr>
-        <w:t xml:space="preserve"> </w:t>
-      </w:r>
-      <w:proofErr w:type="spellStart"/>
-      <w:r>
-        <w:rPr>
-          <w:rFonts w:ascii="Times New Roman" w:hAnsi="Times New Roman" w:cs="Times New Roman"/>
-          <w:sz w:val="26"/>
-          <w:szCs w:val="26"/>
-        </w:rPr>
-        <w:t>tài</w:t>
-      </w:r>
-      <w:proofErr w:type="spellEnd"/>
-      <w:r>
-        <w:rPr>
-          <w:rFonts w:ascii="Times New Roman" w:hAnsi="Times New Roman" w:cs="Times New Roman"/>
-          <w:sz w:val="26"/>
-          <w:szCs w:val="26"/>
-        </w:rPr>
-        <w:t xml:space="preserve"> </w:t>
-      </w:r>
-      <w:proofErr w:type="spellStart"/>
-      <w:r>
-        <w:rPr>
-          <w:rFonts w:ascii="Times New Roman" w:hAnsi="Times New Roman" w:cs="Times New Roman"/>
-          <w:sz w:val="26"/>
-          <w:szCs w:val="26"/>
-        </w:rPr>
-        <w:t>khoản</w:t>
-      </w:r>
-      <w:proofErr w:type="spellEnd"/>
-      <w:r>
-        <w:rPr>
-          <w:rFonts w:ascii="Times New Roman" w:hAnsi="Times New Roman" w:cs="Times New Roman"/>
-          <w:sz w:val="26"/>
-          <w:szCs w:val="26"/>
-        </w:rPr>
-        <w:t xml:space="preserve"> </w:t>
-      </w:r>
-      <w:proofErr w:type="spellStart"/>
-      <w:r>
-        <w:rPr>
-          <w:rFonts w:ascii="Times New Roman" w:hAnsi="Times New Roman" w:cs="Times New Roman"/>
-          <w:sz w:val="26"/>
-          <w:szCs w:val="26"/>
-        </w:rPr>
-        <w:t>thành</w:t>
-      </w:r>
-      <w:proofErr w:type="spellEnd"/>
-      <w:r>
-        <w:rPr>
-          <w:rFonts w:ascii="Times New Roman" w:hAnsi="Times New Roman" w:cs="Times New Roman"/>
-          <w:sz w:val="26"/>
-          <w:szCs w:val="26"/>
-        </w:rPr>
-        <w:t xml:space="preserve"> </w:t>
-      </w:r>
-      <w:proofErr w:type="spellStart"/>
-      <w:r>
-        <w:rPr>
-          <w:rFonts w:ascii="Times New Roman" w:hAnsi="Times New Roman" w:cs="Times New Roman"/>
-          <w:sz w:val="26"/>
-          <w:szCs w:val="26"/>
-        </w:rPr>
-        <w:t>viên</w:t>
-      </w:r>
-      <w:proofErr w:type="spellEnd"/>
-      <w:r>
-        <w:rPr>
-          <w:rFonts w:ascii="Times New Roman" w:hAnsi="Times New Roman" w:cs="Times New Roman"/>
-          <w:sz w:val="26"/>
-          <w:szCs w:val="26"/>
-        </w:rPr>
-        <w:t xml:space="preserve">, </w:t>
-      </w:r>
-      <w:proofErr w:type="spellStart"/>
-      <w:r>
-        <w:rPr>
-          <w:rFonts w:ascii="Times New Roman" w:hAnsi="Times New Roman" w:cs="Times New Roman"/>
-          <w:sz w:val="26"/>
-          <w:szCs w:val="26"/>
-        </w:rPr>
-        <w:t>gồm</w:t>
-      </w:r>
-      <w:proofErr w:type="spellEnd"/>
-      <w:r>
-        <w:rPr>
-          <w:rFonts w:ascii="Times New Roman" w:hAnsi="Times New Roman" w:cs="Times New Roman"/>
-          <w:sz w:val="26"/>
-          <w:szCs w:val="26"/>
-        </w:rPr>
-        <w:t xml:space="preserve"> </w:t>
-      </w:r>
-      <w:proofErr w:type="spellStart"/>
-      <w:r>
-        <w:rPr>
-          <w:rFonts w:ascii="Times New Roman" w:hAnsi="Times New Roman" w:cs="Times New Roman"/>
-          <w:sz w:val="26"/>
-          <w:szCs w:val="26"/>
-        </w:rPr>
-        <w:t>các</w:t>
-      </w:r>
-      <w:proofErr w:type="spellEnd"/>
-      <w:r>
-        <w:rPr>
-          <w:rFonts w:ascii="Times New Roman" w:hAnsi="Times New Roman" w:cs="Times New Roman"/>
-          <w:sz w:val="26"/>
-          <w:szCs w:val="26"/>
-        </w:rPr>
-        <w:t xml:space="preserve"> </w:t>
-      </w:r>
-      <w:proofErr w:type="spellStart"/>
-      <w:r>
-        <w:rPr>
-          <w:rFonts w:ascii="Times New Roman" w:hAnsi="Times New Roman" w:cs="Times New Roman"/>
-          <w:sz w:val="26"/>
-          <w:szCs w:val="26"/>
-        </w:rPr>
-        <w:t>trường</w:t>
-      </w:r>
-      <w:proofErr w:type="spellEnd"/>
-      <w:r>
-        <w:rPr>
-          <w:rFonts w:ascii="Times New Roman" w:hAnsi="Times New Roman" w:cs="Times New Roman"/>
-          <w:sz w:val="26"/>
-          <w:szCs w:val="26"/>
-        </w:rPr>
-        <w:t xml:space="preserve"> </w:t>
-      </w:r>
-      <w:proofErr w:type="spellStart"/>
-      <w:r>
-        <w:rPr>
-          <w:rFonts w:ascii="Times New Roman" w:hAnsi="Times New Roman" w:cs="Times New Roman"/>
-          <w:sz w:val="26"/>
-          <w:szCs w:val="26"/>
-        </w:rPr>
-        <w:t>nhập</w:t>
-      </w:r>
-      <w:proofErr w:type="spellEnd"/>
-      <w:r>
-        <w:rPr>
-          <w:rFonts w:ascii="Times New Roman" w:hAnsi="Times New Roman" w:cs="Times New Roman"/>
-          <w:sz w:val="26"/>
-          <w:szCs w:val="26"/>
-        </w:rPr>
-        <w:t xml:space="preserve">: </w:t>
-      </w:r>
-      <w:proofErr w:type="spellStart"/>
-      <w:r>
-        <w:rPr>
-          <w:rFonts w:ascii="Times New Roman" w:hAnsi="Times New Roman" w:cs="Times New Roman"/>
-          <w:sz w:val="26"/>
-          <w:szCs w:val="26"/>
-        </w:rPr>
-        <w:t>họ</w:t>
-      </w:r>
-      <w:proofErr w:type="spellEnd"/>
-      <w:r>
-        <w:rPr>
-          <w:rFonts w:ascii="Times New Roman" w:hAnsi="Times New Roman" w:cs="Times New Roman"/>
-          <w:sz w:val="26"/>
-          <w:szCs w:val="26"/>
-        </w:rPr>
-        <w:t xml:space="preserve"> </w:t>
-      </w:r>
-      <w:proofErr w:type="spellStart"/>
-      <w:r>
-        <w:rPr>
-          <w:rFonts w:ascii="Times New Roman" w:hAnsi="Times New Roman" w:cs="Times New Roman"/>
-          <w:sz w:val="26"/>
-          <w:szCs w:val="26"/>
-        </w:rPr>
-        <w:t>tên</w:t>
-      </w:r>
-      <w:proofErr w:type="spellEnd"/>
-      <w:r>
-        <w:rPr>
-          <w:rFonts w:ascii="Times New Roman" w:hAnsi="Times New Roman" w:cs="Times New Roman"/>
-          <w:sz w:val="26"/>
-          <w:szCs w:val="26"/>
-        </w:rPr>
-        <w:t xml:space="preserve">, email, </w:t>
-      </w:r>
-      <w:proofErr w:type="spellStart"/>
-      <w:r>
-        <w:rPr>
-          <w:rFonts w:ascii="Times New Roman" w:hAnsi="Times New Roman" w:cs="Times New Roman"/>
-          <w:sz w:val="26"/>
-          <w:szCs w:val="26"/>
-        </w:rPr>
-        <w:t>ngày</w:t>
-      </w:r>
-      <w:proofErr w:type="spellEnd"/>
-      <w:r>
-        <w:rPr>
-          <w:rFonts w:ascii="Times New Roman" w:hAnsi="Times New Roman" w:cs="Times New Roman"/>
-          <w:sz w:val="26"/>
-          <w:szCs w:val="26"/>
-        </w:rPr>
-        <w:t xml:space="preserve"> </w:t>
-      </w:r>
-      <w:proofErr w:type="spellStart"/>
-      <w:r>
-        <w:rPr>
-          <w:rFonts w:ascii="Times New Roman" w:hAnsi="Times New Roman" w:cs="Times New Roman"/>
-          <w:sz w:val="26"/>
-          <w:szCs w:val="26"/>
-        </w:rPr>
-        <w:t>sinh</w:t>
-      </w:r>
-      <w:proofErr w:type="spellEnd"/>
-      <w:r>
-        <w:rPr>
-          <w:rFonts w:ascii="Times New Roman" w:hAnsi="Times New Roman" w:cs="Times New Roman"/>
-          <w:sz w:val="26"/>
-          <w:szCs w:val="26"/>
-        </w:rPr>
-        <w:t xml:space="preserve"> </w:t>
-      </w:r>
-      <w:proofErr w:type="spellStart"/>
-      <w:r>
-        <w:rPr>
-          <w:rFonts w:ascii="Times New Roman" w:hAnsi="Times New Roman" w:cs="Times New Roman"/>
-          <w:sz w:val="26"/>
-          <w:szCs w:val="26"/>
-        </w:rPr>
-        <w:t>tên</w:t>
-      </w:r>
-      <w:proofErr w:type="spellEnd"/>
-      <w:r>
-        <w:rPr>
-          <w:rFonts w:ascii="Times New Roman" w:hAnsi="Times New Roman" w:cs="Times New Roman"/>
-          <w:sz w:val="26"/>
-          <w:szCs w:val="26"/>
-        </w:rPr>
-        <w:t xml:space="preserve"> </w:t>
-      </w:r>
-      <w:proofErr w:type="spellStart"/>
-      <w:r>
-        <w:rPr>
-          <w:rFonts w:ascii="Times New Roman" w:hAnsi="Times New Roman" w:cs="Times New Roman"/>
-          <w:sz w:val="26"/>
-          <w:szCs w:val="26"/>
-        </w:rPr>
-        <w:t>tài</w:t>
-      </w:r>
-      <w:proofErr w:type="spellEnd"/>
-      <w:r>
-        <w:rPr>
-          <w:rFonts w:ascii="Times New Roman" w:hAnsi="Times New Roman" w:cs="Times New Roman"/>
-          <w:sz w:val="26"/>
-          <w:szCs w:val="26"/>
-        </w:rPr>
-        <w:t xml:space="preserve"> </w:t>
-      </w:r>
-      <w:proofErr w:type="spellStart"/>
-      <w:r>
-        <w:rPr>
-          <w:rFonts w:ascii="Times New Roman" w:hAnsi="Times New Roman" w:cs="Times New Roman"/>
-          <w:sz w:val="26"/>
-          <w:szCs w:val="26"/>
-        </w:rPr>
-        <w:t>khoản</w:t>
-      </w:r>
-      <w:proofErr w:type="spellEnd"/>
-      <w:r>
-        <w:rPr>
-          <w:rFonts w:ascii="Times New Roman" w:hAnsi="Times New Roman" w:cs="Times New Roman"/>
-          <w:sz w:val="26"/>
-          <w:szCs w:val="26"/>
-        </w:rPr>
-        <w:t xml:space="preserve">, </w:t>
-      </w:r>
-      <w:proofErr w:type="spellStart"/>
-      <w:r>
-        <w:rPr>
-          <w:rFonts w:ascii="Times New Roman" w:hAnsi="Times New Roman" w:cs="Times New Roman"/>
-          <w:sz w:val="26"/>
-          <w:szCs w:val="26"/>
-        </w:rPr>
-        <w:t>mật</w:t>
-      </w:r>
-      <w:proofErr w:type="spellEnd"/>
-      <w:r>
-        <w:rPr>
-          <w:rFonts w:ascii="Times New Roman" w:hAnsi="Times New Roman" w:cs="Times New Roman"/>
-          <w:sz w:val="26"/>
-          <w:szCs w:val="26"/>
-        </w:rPr>
-        <w:t xml:space="preserve"> </w:t>
-      </w:r>
-      <w:proofErr w:type="spellStart"/>
-      <w:r>
-        <w:rPr>
-          <w:rFonts w:ascii="Times New Roman" w:hAnsi="Times New Roman" w:cs="Times New Roman"/>
-          <w:sz w:val="26"/>
-          <w:szCs w:val="26"/>
-        </w:rPr>
-        <w:t>khẩu</w:t>
-      </w:r>
-      <w:proofErr w:type="spellEnd"/>
-      <w:r>
-        <w:rPr>
-          <w:rFonts w:ascii="Times New Roman" w:hAnsi="Times New Roman" w:cs="Times New Roman"/>
-          <w:sz w:val="26"/>
-          <w:szCs w:val="26"/>
-        </w:rPr>
-        <w:t xml:space="preserve">, </w:t>
-      </w:r>
-      <w:proofErr w:type="spellStart"/>
-      <w:r>
-        <w:rPr>
-          <w:rFonts w:ascii="Times New Roman" w:hAnsi="Times New Roman" w:cs="Times New Roman"/>
-          <w:sz w:val="26"/>
-          <w:szCs w:val="26"/>
-        </w:rPr>
-        <w:t>nhập</w:t>
-      </w:r>
-      <w:proofErr w:type="spellEnd"/>
-      <w:r>
-        <w:rPr>
-          <w:rFonts w:ascii="Times New Roman" w:hAnsi="Times New Roman" w:cs="Times New Roman"/>
-          <w:sz w:val="26"/>
-          <w:szCs w:val="26"/>
-        </w:rPr>
-        <w:t xml:space="preserve"> </w:t>
-      </w:r>
-      <w:proofErr w:type="spellStart"/>
-      <w:r>
-        <w:rPr>
-          <w:rFonts w:ascii="Times New Roman" w:hAnsi="Times New Roman" w:cs="Times New Roman"/>
-          <w:sz w:val="26"/>
-          <w:szCs w:val="26"/>
-        </w:rPr>
-        <w:t>lại</w:t>
-      </w:r>
-      <w:proofErr w:type="spellEnd"/>
-      <w:r>
-        <w:rPr>
-          <w:rFonts w:ascii="Times New Roman" w:hAnsi="Times New Roman" w:cs="Times New Roman"/>
-          <w:sz w:val="26"/>
-          <w:szCs w:val="26"/>
-        </w:rPr>
-        <w:t xml:space="preserve"> </w:t>
-      </w:r>
-      <w:proofErr w:type="spellStart"/>
-      <w:r>
-        <w:rPr>
-          <w:rFonts w:ascii="Times New Roman" w:hAnsi="Times New Roman" w:cs="Times New Roman"/>
-          <w:sz w:val="26"/>
-          <w:szCs w:val="26"/>
-        </w:rPr>
-        <w:t>mật</w:t>
-      </w:r>
-      <w:proofErr w:type="spellEnd"/>
-      <w:r>
-        <w:rPr>
-          <w:rFonts w:ascii="Times New Roman" w:hAnsi="Times New Roman" w:cs="Times New Roman"/>
-          <w:sz w:val="26"/>
-          <w:szCs w:val="26"/>
-        </w:rPr>
-        <w:t xml:space="preserve"> </w:t>
-      </w:r>
-      <w:proofErr w:type="spellStart"/>
-      <w:r>
-        <w:rPr>
-          <w:rFonts w:ascii="Times New Roman" w:hAnsi="Times New Roman" w:cs="Times New Roman"/>
-          <w:sz w:val="26"/>
-          <w:szCs w:val="26"/>
-        </w:rPr>
-        <w:t>khẩu</w:t>
-      </w:r>
-      <w:proofErr w:type="spellEnd"/>
-      <w:r>
-        <w:rPr>
-          <w:rFonts w:ascii="Times New Roman" w:hAnsi="Times New Roman" w:cs="Times New Roman"/>
-          <w:sz w:val="26"/>
-          <w:szCs w:val="26"/>
-        </w:rPr>
-        <w:t>,</w:t>
+        <w:t>: form đăng ký tài khoản thành viên, gồm các trường nhập: họ tên, email, ngày sinh tên tài khoản, mật khẩu, nhập lại mật khẩu,</w:t>
       </w:r>
       <w:r>
         <w:rPr>
@@ -6154,187 +3592,15 @@
           <w:sz w:val="26"/>
           <w:szCs w:val="26"/>
         </w:rPr>
-        <w:t xml:space="preserve"> </w:t>
+        <w:t xml:space="preserve"> nút đăng ký</w:t>
       </w:r>
-      <w:proofErr w:type="spellStart"/>
       <w:r>
         <w:rPr>
           <w:rFonts w:ascii="Times New Roman" w:hAnsi="Times New Roman" w:cs="Times New Roman"/>
           <w:sz w:val="26"/>
           <w:szCs w:val="26"/>
         </w:rPr>
-        <w:t>nút</w:t>
-      </w:r>
-      <w:proofErr w:type="spellEnd"/>
-      <w:r>
-        <w:rPr>
-          <w:rFonts w:ascii="Times New Roman" w:hAnsi="Times New Roman" w:cs="Times New Roman"/>
-          <w:sz w:val="26"/>
-          <w:szCs w:val="26"/>
-        </w:rPr>
-        <w:t xml:space="preserve"> </w:t>
-      </w:r>
-      <w:proofErr w:type="spellStart"/>
-      <w:r>
-        <w:rPr>
-          <w:rFonts w:ascii="Times New Roman" w:hAnsi="Times New Roman" w:cs="Times New Roman"/>
-          <w:sz w:val="26"/>
-          <w:szCs w:val="26"/>
-        </w:rPr>
-        <w:t>đăng</w:t>
-      </w:r>
-      <w:proofErr w:type="spellEnd"/>
-      <w:r>
-        <w:rPr>
-          <w:rFonts w:ascii="Times New Roman" w:hAnsi="Times New Roman" w:cs="Times New Roman"/>
-          <w:sz w:val="26"/>
-          <w:szCs w:val="26"/>
-        </w:rPr>
-        <w:t xml:space="preserve"> </w:t>
-      </w:r>
-      <w:proofErr w:type="spellStart"/>
-      <w:r>
-        <w:rPr>
-          <w:rFonts w:ascii="Times New Roman" w:hAnsi="Times New Roman" w:cs="Times New Roman"/>
-          <w:sz w:val="26"/>
-          <w:szCs w:val="26"/>
-        </w:rPr>
-        <w:t>ký</w:t>
-      </w:r>
-      <w:proofErr w:type="spellEnd"/>
-      <w:r>
-        <w:rPr>
-          <w:rFonts w:ascii="Times New Roman" w:hAnsi="Times New Roman" w:cs="Times New Roman"/>
-          <w:sz w:val="26"/>
-          <w:szCs w:val="26"/>
-        </w:rPr>
-        <w:t xml:space="preserve">, </w:t>
-      </w:r>
-      <w:proofErr w:type="spellStart"/>
-      <w:r>
-        <w:rPr>
-          <w:rFonts w:ascii="Times New Roman" w:hAnsi="Times New Roman" w:cs="Times New Roman"/>
-          <w:sz w:val="26"/>
-          <w:szCs w:val="26"/>
-        </w:rPr>
-        <w:t>giới</w:t>
-      </w:r>
-      <w:proofErr w:type="spellEnd"/>
-      <w:r>
-        <w:rPr>
-          <w:rFonts w:ascii="Times New Roman" w:hAnsi="Times New Roman" w:cs="Times New Roman"/>
-          <w:sz w:val="26"/>
-          <w:szCs w:val="26"/>
-        </w:rPr>
-        <w:t xml:space="preserve"> </w:t>
-      </w:r>
-      <w:proofErr w:type="spellStart"/>
-      <w:r>
-        <w:rPr>
-          <w:rFonts w:ascii="Times New Roman" w:hAnsi="Times New Roman" w:cs="Times New Roman"/>
-          <w:sz w:val="26"/>
-          <w:szCs w:val="26"/>
-        </w:rPr>
-        <w:t>tính</w:t>
-      </w:r>
-      <w:proofErr w:type="spellEnd"/>
-      <w:r>
-        <w:rPr>
-          <w:rFonts w:ascii="Times New Roman" w:hAnsi="Times New Roman" w:cs="Times New Roman"/>
-          <w:sz w:val="26"/>
-          <w:szCs w:val="26"/>
-        </w:rPr>
-        <w:t xml:space="preserve">, </w:t>
-      </w:r>
-      <w:proofErr w:type="spellStart"/>
-      <w:r>
-        <w:rPr>
-          <w:rFonts w:ascii="Times New Roman" w:hAnsi="Times New Roman" w:cs="Times New Roman"/>
-          <w:sz w:val="26"/>
-          <w:szCs w:val="26"/>
-        </w:rPr>
-        <w:t>số</w:t>
-      </w:r>
-      <w:proofErr w:type="spellEnd"/>
-      <w:r>
-        <w:rPr>
-          <w:rFonts w:ascii="Times New Roman" w:hAnsi="Times New Roman" w:cs="Times New Roman"/>
-          <w:sz w:val="26"/>
-          <w:szCs w:val="26"/>
-        </w:rPr>
-        <w:t xml:space="preserve"> </w:t>
-      </w:r>
-      <w:proofErr w:type="spellStart"/>
-      <w:r>
-        <w:rPr>
-          <w:rFonts w:ascii="Times New Roman" w:hAnsi="Times New Roman" w:cs="Times New Roman"/>
-          <w:sz w:val="26"/>
-          <w:szCs w:val="26"/>
-        </w:rPr>
-        <w:t>điện</w:t>
-      </w:r>
-      <w:proofErr w:type="spellEnd"/>
-      <w:r>
-        <w:rPr>
-          <w:rFonts w:ascii="Times New Roman" w:hAnsi="Times New Roman" w:cs="Times New Roman"/>
-          <w:sz w:val="26"/>
-          <w:szCs w:val="26"/>
-        </w:rPr>
-        <w:t xml:space="preserve"> </w:t>
-      </w:r>
-      <w:proofErr w:type="spellStart"/>
-      <w:r>
-        <w:rPr>
-          <w:rFonts w:ascii="Times New Roman" w:hAnsi="Times New Roman" w:cs="Times New Roman"/>
-          <w:sz w:val="26"/>
-          <w:szCs w:val="26"/>
-        </w:rPr>
-        <w:t>thoại</w:t>
-      </w:r>
-      <w:proofErr w:type="spellEnd"/>
-      <w:r>
-        <w:rPr>
-          <w:rFonts w:ascii="Times New Roman" w:hAnsi="Times New Roman" w:cs="Times New Roman"/>
-          <w:sz w:val="26"/>
-          <w:szCs w:val="26"/>
-        </w:rPr>
-        <w:t xml:space="preserve">, </w:t>
-      </w:r>
-      <w:proofErr w:type="spellStart"/>
-      <w:r>
-        <w:rPr>
-          <w:rFonts w:ascii="Times New Roman" w:hAnsi="Times New Roman" w:cs="Times New Roman"/>
-          <w:sz w:val="26"/>
-          <w:szCs w:val="26"/>
-        </w:rPr>
-        <w:t>địa</w:t>
-      </w:r>
-      <w:proofErr w:type="spellEnd"/>
-      <w:r>
-        <w:rPr>
-          <w:rFonts w:ascii="Times New Roman" w:hAnsi="Times New Roman" w:cs="Times New Roman"/>
-          <w:sz w:val="26"/>
-          <w:szCs w:val="26"/>
-        </w:rPr>
-        <w:t xml:space="preserve"> </w:t>
-      </w:r>
-      <w:proofErr w:type="spellStart"/>
-      <w:r>
-        <w:rPr>
-          <w:rFonts w:ascii="Times New Roman" w:hAnsi="Times New Roman" w:cs="Times New Roman"/>
-          <w:sz w:val="26"/>
-          <w:szCs w:val="26"/>
-        </w:rPr>
-        <w:t>chỉ</w:t>
-      </w:r>
-      <w:proofErr w:type="spellEnd"/>
-      <w:r>
-        <w:rPr>
-          <w:rFonts w:ascii="Times New Roman" w:hAnsi="Times New Roman" w:cs="Times New Roman"/>
-          <w:sz w:val="26"/>
-          <w:szCs w:val="26"/>
-        </w:rPr>
-        <w:t>.</w:t>
+        <w:t>, giới tính, số điện thoại, địa chỉ.</w:t>
       </w:r>
       <w:r>
         <w:rPr>
@@ -6398,7 +3664,6 @@
           <w:szCs w:val="26"/>
         </w:rPr>
       </w:pPr>
-      <w:proofErr w:type="spellStart"/>
       <w:r>
         <w:rPr>
           <w:i/>
@@ -6406,197 +3671,7 @@
           <w:sz w:val="26"/>
           <w:szCs w:val="26"/>
         </w:rPr>
-        <w:t>Sơ</w:t>
-      </w:r>
-      <w:proofErr w:type="spellEnd"/>
-      <w:r>
-        <w:rPr>
-          <w:i/>
-          <w:color w:val="FF0000"/>
-          <w:sz w:val="26"/>
-          <w:szCs w:val="26"/>
-        </w:rPr>
-        <w:t xml:space="preserve"> </w:t>
-      </w:r>
-      <w:proofErr w:type="spellStart"/>
-      <w:r>
-        <w:rPr>
-          <w:i/>
-          <w:color w:val="FF0000"/>
-          <w:sz w:val="26"/>
-          <w:szCs w:val="26"/>
-        </w:rPr>
-        <w:t>đồ</w:t>
-      </w:r>
-      <w:proofErr w:type="spellEnd"/>
-      <w:r>
-        <w:rPr>
-          <w:i/>
-          <w:color w:val="FF0000"/>
-          <w:sz w:val="26"/>
-          <w:szCs w:val="26"/>
-        </w:rPr>
-        <w:t xml:space="preserve"> </w:t>
-      </w:r>
-      <w:proofErr w:type="spellStart"/>
-      <w:r>
-        <w:rPr>
-          <w:i/>
-          <w:color w:val="FF0000"/>
-          <w:sz w:val="26"/>
-          <w:szCs w:val="26"/>
-        </w:rPr>
-        <w:t>về</w:t>
-      </w:r>
-      <w:proofErr w:type="spellEnd"/>
-      <w:r>
-        <w:rPr>
-          <w:i/>
-          <w:color w:val="FF0000"/>
-          <w:sz w:val="26"/>
-          <w:szCs w:val="26"/>
-        </w:rPr>
-        <w:t xml:space="preserve"> </w:t>
-      </w:r>
-      <w:proofErr w:type="spellStart"/>
-      <w:r>
-        <w:rPr>
-          <w:i/>
-          <w:color w:val="FF0000"/>
-          <w:sz w:val="26"/>
-          <w:szCs w:val="26"/>
-        </w:rPr>
-        <w:t>mối</w:t>
-      </w:r>
-      <w:proofErr w:type="spellEnd"/>
-      <w:r>
-        <w:rPr>
-          <w:i/>
-          <w:color w:val="FF0000"/>
-          <w:sz w:val="26"/>
-          <w:szCs w:val="26"/>
-        </w:rPr>
-        <w:t xml:space="preserve"> </w:t>
-      </w:r>
-      <w:proofErr w:type="spellStart"/>
-      <w:r>
-        <w:rPr>
-          <w:i/>
-          <w:color w:val="FF0000"/>
-          <w:sz w:val="26"/>
-          <w:szCs w:val="26"/>
-        </w:rPr>
-        <w:t>quan</w:t>
-      </w:r>
-      <w:proofErr w:type="spellEnd"/>
-      <w:r>
-        <w:rPr>
-          <w:i/>
-          <w:color w:val="FF0000"/>
-          <w:sz w:val="26"/>
-          <w:szCs w:val="26"/>
-        </w:rPr>
-        <w:t xml:space="preserve"> </w:t>
-      </w:r>
-      <w:proofErr w:type="spellStart"/>
-      <w:r>
-        <w:rPr>
-          <w:i/>
-          <w:color w:val="FF0000"/>
-          <w:sz w:val="26"/>
-          <w:szCs w:val="26"/>
-        </w:rPr>
-        <w:t>hệ</w:t>
-      </w:r>
-      <w:proofErr w:type="spellEnd"/>
-      <w:r>
-        <w:rPr>
-          <w:i/>
-          <w:color w:val="FF0000"/>
-          <w:sz w:val="26"/>
-          <w:szCs w:val="26"/>
-        </w:rPr>
-        <w:t xml:space="preserve"> </w:t>
-      </w:r>
-      <w:proofErr w:type="spellStart"/>
-      <w:r>
-        <w:rPr>
-          <w:i/>
-          <w:color w:val="FF0000"/>
-          <w:sz w:val="26"/>
-          <w:szCs w:val="26"/>
-        </w:rPr>
-        <w:t>của</w:t>
-      </w:r>
-      <w:proofErr w:type="spellEnd"/>
-      <w:r>
-        <w:rPr>
-          <w:i/>
-          <w:color w:val="FF0000"/>
-          <w:sz w:val="26"/>
-          <w:szCs w:val="26"/>
-        </w:rPr>
-        <w:t xml:space="preserve"> </w:t>
-      </w:r>
-      <w:proofErr w:type="spellStart"/>
-      <w:r>
-        <w:rPr>
-          <w:i/>
-          <w:color w:val="FF0000"/>
-          <w:sz w:val="26"/>
-          <w:szCs w:val="26"/>
-        </w:rPr>
-        <w:t>các</w:t>
-      </w:r>
-      <w:proofErr w:type="spellEnd"/>
-      <w:r>
-        <w:rPr>
-          <w:i/>
-          <w:color w:val="FF0000"/>
-          <w:sz w:val="26"/>
-          <w:szCs w:val="26"/>
-        </w:rPr>
-        <w:t xml:space="preserve"> </w:t>
-      </w:r>
-      <w:proofErr w:type="spellStart"/>
-      <w:r>
-        <w:rPr>
-          <w:i/>
-          <w:color w:val="FF0000"/>
-          <w:sz w:val="26"/>
-          <w:szCs w:val="26"/>
-        </w:rPr>
-        <w:t>trang</w:t>
-      </w:r>
-      <w:proofErr w:type="spellEnd"/>
-      <w:r>
-        <w:rPr>
-          <w:i/>
-          <w:color w:val="FF0000"/>
-          <w:sz w:val="26"/>
-          <w:szCs w:val="26"/>
-        </w:rPr>
-        <w:t xml:space="preserve"> </w:t>
-      </w:r>
-      <w:proofErr w:type="spellStart"/>
-      <w:r>
-        <w:rPr>
-          <w:i/>
-          <w:color w:val="FF0000"/>
-          <w:sz w:val="26"/>
-          <w:szCs w:val="26"/>
-        </w:rPr>
-        <w:t>trong</w:t>
-      </w:r>
-      <w:proofErr w:type="spellEnd"/>
-      <w:r>
-        <w:rPr>
-          <w:i/>
-          <w:color w:val="FF0000"/>
-          <w:sz w:val="26"/>
-          <w:szCs w:val="26"/>
-        </w:rPr>
-        <w:t xml:space="preserve"> website. </w:t>
+        <w:t xml:space="preserve">Sơ đồ về mối quan hệ của các trang trong website. </w:t>
       </w:r>
     </w:p>
     <w:p/>
@@ -6637,132 +3712,28 @@
         <w:pStyle w:val="Heading3"/>
       </w:pPr>
       <w:r>
-        <w:t xml:space="preserve">Trang </w:t>
+        <w:t>Trang đăng nhập</w:t>
       </w:r>
-      <w:proofErr w:type="spellStart"/>
-      <w:r>
-        <w:t>đăng</w:t>
-      </w:r>
-      <w:proofErr w:type="spellEnd"/>
-      <w:r>
-        <w:t xml:space="preserve"> </w:t>
-      </w:r>
-      <w:proofErr w:type="spellStart"/>
-      <w:r>
-        <w:t>nhập</w:t>
-      </w:r>
-      <w:proofErr w:type="spellEnd"/>
     </w:p>
     <w:p/>
     <w:p>
       <w:r>
         <w:br w:type="page"/>
       </w:r>
-      <w:r>
-        <w:rPr>
-          <w:noProof/>
-        </w:rPr>
-        <w:lastRenderedPageBreak/>
-        <w:drawing>
-          <wp:inline distT="0" distB="0" distL="0" distR="0" wp14:anchorId="687B1E1D" wp14:editId="79C6B58C">
-            <wp:extent cx="6511925" cy="3286760"/>
-            <wp:effectExtent l="0" t="0" r="3175" b="8890"/>
-            <wp:docPr id="9" name="Picture 9"/>
-            <wp:cNvGraphicFramePr>
-              <a:graphicFrameLocks xmlns:a="http://schemas.openxmlformats.org/drawingml/2006/main" noChangeAspect="1"/>
-            </wp:cNvGraphicFramePr>
-            <a:graphic xmlns:a="http://schemas.openxmlformats.org/drawingml/2006/main">
-              <a:graphicData uri="http://schemas.openxmlformats.org/drawingml/2006/picture">
-                <pic:pic xmlns:pic="http://schemas.openxmlformats.org/drawingml/2006/picture">
-                  <pic:nvPicPr>
-                    <pic:cNvPr id="1" name=""/>
-                    <pic:cNvPicPr/>
-                  </pic:nvPicPr>
-                  <pic:blipFill>
-                    <a:blip r:embed="rId13"/>
-                    <a:stretch>
-                      <a:fillRect/>
-                    </a:stretch>
-                  </pic:blipFill>
-                  <pic:spPr>
-                    <a:xfrm>
-                      <a:off x="0" y="0"/>
-                      <a:ext cx="6511925" cy="3286760"/>
-                    </a:xfrm>
-                    <a:prstGeom prst="rect">
-                      <a:avLst/>
-                    </a:prstGeom>
-                  </pic:spPr>
-                </pic:pic>
-              </a:graphicData>
-            </a:graphic>
-          </wp:inline>
-        </w:drawing>
-      </w:r>
     </w:p>
     <w:p>
       <w:pPr>
         <w:pStyle w:val="Heading3"/>
       </w:pPr>
       <w:r>
-        <w:t xml:space="preserve">Trang </w:t>
+        <w:lastRenderedPageBreak/>
+        <w:t xml:space="preserve">Trang đăng </w:t>
       </w:r>
-      <w:proofErr w:type="spellStart"/>
-      <w:r>
-        <w:t>đăng</w:t>
-      </w:r>
-      <w:proofErr w:type="spellEnd"/>
-      <w:r>
-        <w:t xml:space="preserve"> </w:t>
-      </w:r>
-      <w:proofErr w:type="spellStart"/>
       <w:r>
         <w:t>ký</w:t>
       </w:r>
-      <w:proofErr w:type="spellEnd"/>
     </w:p>
-    <w:p>
-      <w:r>
-        <w:rPr>
-          <w:noProof/>
-        </w:rPr>
-        <w:drawing>
-          <wp:inline distT="0" distB="0" distL="0" distR="0" wp14:anchorId="44B075EA" wp14:editId="39A756BA">
-            <wp:extent cx="6511925" cy="3276600"/>
-            <wp:effectExtent l="0" t="0" r="3175" b="0"/>
-            <wp:docPr id="10" name="Picture 10"/>
-            <wp:cNvGraphicFramePr>
-              <a:graphicFrameLocks xmlns:a="http://schemas.openxmlformats.org/drawingml/2006/main" noChangeAspect="1"/>
-            </wp:cNvGraphicFramePr>
-            <a:graphic xmlns:a="http://schemas.openxmlformats.org/drawingml/2006/main">
-              <a:graphicData uri="http://schemas.openxmlformats.org/drawingml/2006/picture">
-                <pic:pic xmlns:pic="http://schemas.openxmlformats.org/drawingml/2006/picture">
-                  <pic:nvPicPr>
-                    <pic:cNvPr id="1" name=""/>
-                    <pic:cNvPicPr/>
-                  </pic:nvPicPr>
-                  <pic:blipFill>
-                    <a:blip r:embed="rId14"/>
-                    <a:stretch>
-                      <a:fillRect/>
-                    </a:stretch>
-                  </pic:blipFill>
-                  <pic:spPr>
-                    <a:xfrm>
-                      <a:off x="0" y="0"/>
-                      <a:ext cx="6511925" cy="3276600"/>
-                    </a:xfrm>
-                    <a:prstGeom prst="rect">
-                      <a:avLst/>
-                    </a:prstGeom>
-                  </pic:spPr>
-                </pic:pic>
-              </a:graphicData>
-            </a:graphic>
-          </wp:inline>
-        </w:drawing>
-      </w:r>
-    </w:p>
+    <w:p/>
     <w:p>
       <w:r>
         <w:br w:type="page"/>
@@ -6796,36 +3767,10 @@
         <w:pStyle w:val="Heading2"/>
       </w:pPr>
       <w:bookmarkStart w:id="8" w:name="_Toc41542393"/>
-      <w:proofErr w:type="spellStart"/>
       <w:r>
-        <w:t>Kết</w:t>
-      </w:r>
-      <w:proofErr w:type="spellEnd"/>
-      <w:r>
-        <w:t xml:space="preserve"> </w:t>
-      </w:r>
-      <w:proofErr w:type="spellStart"/>
-      <w:r>
-        <w:t>quả</w:t>
-      </w:r>
-      <w:proofErr w:type="spellEnd"/>
-      <w:r>
-        <w:t xml:space="preserve"> </w:t>
-      </w:r>
-      <w:proofErr w:type="spellStart"/>
-      <w:r>
-        <w:t>đạt</w:t>
-      </w:r>
-      <w:proofErr w:type="spellEnd"/>
-      <w:r>
-        <w:t xml:space="preserve"> </w:t>
-      </w:r>
-      <w:proofErr w:type="spellStart"/>
-      <w:r>
-        <w:t>được</w:t>
+        <w:t>Kết quả đạt được</w:t>
       </w:r>
       <w:bookmarkEnd w:id="8"/>
-      <w:proofErr w:type="spellEnd"/>
     </w:p>
     <w:p>
       <w:pPr>
@@ -6845,139 +3790,7 @@
           <w:sz w:val="26"/>
           <w:szCs w:val="26"/>
         </w:rPr>
-        <w:t xml:space="preserve">Hoàn </w:t>
-      </w:r>
-      <w:proofErr w:type="spellStart"/>
-      <w:r>
-        <w:rPr>
-          <w:rFonts w:cstheme="minorHAnsi"/>
-          <w:i/>
-          <w:color w:val="FF0000"/>
-          <w:sz w:val="26"/>
-          <w:szCs w:val="26"/>
-        </w:rPr>
-        <w:t>thành</w:t>
-      </w:r>
-      <w:proofErr w:type="spellEnd"/>
-      <w:r>
-        <w:rPr>
-          <w:rFonts w:cstheme="minorHAnsi"/>
-          <w:i/>
-          <w:color w:val="FF0000"/>
-          <w:sz w:val="26"/>
-          <w:szCs w:val="26"/>
-        </w:rPr>
-        <w:t xml:space="preserve"> </w:t>
-      </w:r>
-      <w:proofErr w:type="spellStart"/>
-      <w:r>
-        <w:rPr>
-          <w:rFonts w:cstheme="minorHAnsi"/>
-          <w:i/>
-          <w:color w:val="FF0000"/>
-          <w:sz w:val="26"/>
-          <w:szCs w:val="26"/>
-        </w:rPr>
-        <w:t>được</w:t>
-      </w:r>
-      <w:proofErr w:type="spellEnd"/>
-      <w:r>
-        <w:rPr>
-          <w:rFonts w:cstheme="minorHAnsi"/>
-          <w:i/>
-          <w:color w:val="FF0000"/>
-          <w:sz w:val="26"/>
-          <w:szCs w:val="26"/>
-        </w:rPr>
-        <w:t xml:space="preserve"> </w:t>
-      </w:r>
-      <w:proofErr w:type="spellStart"/>
-      <w:r>
-        <w:rPr>
-          <w:rFonts w:cstheme="minorHAnsi"/>
-          <w:i/>
-          <w:color w:val="FF0000"/>
-          <w:sz w:val="26"/>
-          <w:szCs w:val="26"/>
-        </w:rPr>
-        <w:t>các</w:t>
-      </w:r>
-      <w:proofErr w:type="spellEnd"/>
-      <w:r>
-        <w:rPr>
-          <w:rFonts w:cstheme="minorHAnsi"/>
-          <w:i/>
-          <w:color w:val="FF0000"/>
-          <w:sz w:val="26"/>
-          <w:szCs w:val="26"/>
-        </w:rPr>
-        <w:t xml:space="preserve"> </w:t>
-      </w:r>
-      <w:proofErr w:type="spellStart"/>
-      <w:r>
-        <w:rPr>
-          <w:rFonts w:cstheme="minorHAnsi"/>
-          <w:i/>
-          <w:color w:val="FF0000"/>
-          <w:sz w:val="26"/>
-          <w:szCs w:val="26"/>
-        </w:rPr>
-        <w:t>chức</w:t>
-      </w:r>
-      <w:proofErr w:type="spellEnd"/>
-      <w:r>
-        <w:rPr>
-          <w:rFonts w:cstheme="minorHAnsi"/>
-          <w:i/>
-          <w:color w:val="FF0000"/>
-          <w:sz w:val="26"/>
-          <w:szCs w:val="26"/>
-        </w:rPr>
-        <w:t xml:space="preserve"> </w:t>
-      </w:r>
-      <w:proofErr w:type="spellStart"/>
-      <w:r>
-        <w:rPr>
-          <w:rFonts w:cstheme="minorHAnsi"/>
-          <w:i/>
-          <w:color w:val="FF0000"/>
-          <w:sz w:val="26"/>
-          <w:szCs w:val="26"/>
-        </w:rPr>
-        <w:t>năng</w:t>
-      </w:r>
-      <w:proofErr w:type="spellEnd"/>
-      <w:r>
-        <w:rPr>
-          <w:rFonts w:cstheme="minorHAnsi"/>
-          <w:i/>
-          <w:color w:val="FF0000"/>
-          <w:sz w:val="26"/>
-          <w:szCs w:val="26"/>
-        </w:rPr>
-        <w:t xml:space="preserve"> </w:t>
-      </w:r>
-      <w:proofErr w:type="spellStart"/>
-      <w:r>
-        <w:rPr>
-          <w:rFonts w:cstheme="minorHAnsi"/>
-          <w:i/>
-          <w:color w:val="FF0000"/>
-          <w:sz w:val="26"/>
-          <w:szCs w:val="26"/>
-        </w:rPr>
-        <w:t>của</w:t>
-      </w:r>
-      <w:proofErr w:type="spellEnd"/>
-      <w:r>
-        <w:rPr>
-          <w:rFonts w:cstheme="minorHAnsi"/>
-          <w:i/>
-          <w:color w:val="FF0000"/>
-          <w:sz w:val="26"/>
-          <w:szCs w:val="26"/>
-        </w:rPr>
-        <w:t xml:space="preserve"> </w:t>
+        <w:t xml:space="preserve">Hoàn thành được các chức năng của </w:t>
       </w:r>
       <w:r>
         <w:rPr>
@@ -6987,174 +3800,8 @@
           <w:sz w:val="26"/>
           <w:szCs w:val="26"/>
         </w:rPr>
-        <w:t xml:space="preserve">website </w:t>
+        <w:t>website như ban đầu đề ra đối với ueser, admin ????</w:t>
       </w:r>
-      <w:proofErr w:type="spellStart"/>
-      <w:r>
-        <w:rPr>
-          <w:rFonts w:cstheme="minorHAnsi"/>
-          <w:i/>
-          <w:color w:val="FF0000"/>
-          <w:sz w:val="26"/>
-          <w:szCs w:val="26"/>
-        </w:rPr>
-        <w:t>như</w:t>
-      </w:r>
-      <w:proofErr w:type="spellEnd"/>
-      <w:r>
-        <w:rPr>
-          <w:rFonts w:cstheme="minorHAnsi"/>
-          <w:i/>
-          <w:color w:val="FF0000"/>
-          <w:sz w:val="26"/>
-          <w:szCs w:val="26"/>
-        </w:rPr>
-        <w:t xml:space="preserve"> ban </w:t>
-      </w:r>
-      <w:proofErr w:type="spellStart"/>
-      <w:r>
-        <w:rPr>
-          <w:rFonts w:cstheme="minorHAnsi"/>
-          <w:i/>
-          <w:color w:val="FF0000"/>
-          <w:sz w:val="26"/>
-          <w:szCs w:val="26"/>
-        </w:rPr>
-        <w:t>đầu</w:t>
-      </w:r>
-      <w:proofErr w:type="spellEnd"/>
-      <w:r>
-        <w:rPr>
-          <w:rFonts w:cstheme="minorHAnsi"/>
-          <w:i/>
-          <w:color w:val="FF0000"/>
-          <w:sz w:val="26"/>
-          <w:szCs w:val="26"/>
-        </w:rPr>
-        <w:t xml:space="preserve"> </w:t>
-      </w:r>
-      <w:proofErr w:type="spellStart"/>
-      <w:r>
-        <w:rPr>
-          <w:rFonts w:cstheme="minorHAnsi"/>
-          <w:i/>
-          <w:color w:val="FF0000"/>
-          <w:sz w:val="26"/>
-          <w:szCs w:val="26"/>
-        </w:rPr>
-        <w:t>đề</w:t>
-      </w:r>
-      <w:proofErr w:type="spellEnd"/>
-      <w:r>
-        <w:rPr>
-          <w:rFonts w:cstheme="minorHAnsi"/>
-          <w:i/>
-          <w:color w:val="FF0000"/>
-          <w:sz w:val="26"/>
-          <w:szCs w:val="26"/>
-        </w:rPr>
-        <w:t xml:space="preserve"> </w:t>
-      </w:r>
-      <w:proofErr w:type="spellStart"/>
-      <w:r>
-        <w:rPr>
-          <w:rFonts w:cstheme="minorHAnsi"/>
-          <w:i/>
-          <w:color w:val="FF0000"/>
-          <w:sz w:val="26"/>
-          <w:szCs w:val="26"/>
-        </w:rPr>
-        <w:t>ra</w:t>
-      </w:r>
-      <w:proofErr w:type="spellEnd"/>
-      <w:r>
-        <w:rPr>
-          <w:rFonts w:cstheme="minorHAnsi"/>
-          <w:i/>
-          <w:color w:val="FF0000"/>
-          <w:sz w:val="26"/>
-          <w:szCs w:val="26"/>
-        </w:rPr>
-        <w:t xml:space="preserve"> </w:t>
-      </w:r>
-      <w:proofErr w:type="spellStart"/>
-      <w:r>
-        <w:rPr>
-          <w:rFonts w:cstheme="minorHAnsi"/>
-          <w:i/>
-          <w:color w:val="FF0000"/>
-          <w:sz w:val="26"/>
-          <w:szCs w:val="26"/>
-        </w:rPr>
-        <w:t>đối</w:t>
-      </w:r>
-      <w:proofErr w:type="spellEnd"/>
-      <w:r>
-        <w:rPr>
-          <w:rFonts w:cstheme="minorHAnsi"/>
-          <w:i/>
-          <w:color w:val="FF0000"/>
-          <w:sz w:val="26"/>
-          <w:szCs w:val="26"/>
-        </w:rPr>
-        <w:t xml:space="preserve"> </w:t>
-      </w:r>
-      <w:proofErr w:type="spellStart"/>
-      <w:r>
-        <w:rPr>
-          <w:rFonts w:cstheme="minorHAnsi"/>
-          <w:i/>
-          <w:color w:val="FF0000"/>
-          <w:sz w:val="26"/>
-          <w:szCs w:val="26"/>
-        </w:rPr>
-        <w:t>với</w:t>
-      </w:r>
-      <w:proofErr w:type="spellEnd"/>
-      <w:r>
-        <w:rPr>
-          <w:rFonts w:cstheme="minorHAnsi"/>
-          <w:i/>
-          <w:color w:val="FF0000"/>
-          <w:sz w:val="26"/>
-          <w:szCs w:val="26"/>
-        </w:rPr>
-        <w:t xml:space="preserve"> </w:t>
-      </w:r>
-      <w:proofErr w:type="spellStart"/>
-      <w:r>
-        <w:rPr>
-          <w:rFonts w:cstheme="minorHAnsi"/>
-          <w:i/>
-          <w:color w:val="FF0000"/>
-          <w:sz w:val="26"/>
-          <w:szCs w:val="26"/>
-        </w:rPr>
-        <w:t>ueser</w:t>
-      </w:r>
-      <w:proofErr w:type="spellEnd"/>
-      <w:r>
-        <w:rPr>
-          <w:rFonts w:cstheme="minorHAnsi"/>
-          <w:i/>
-          <w:color w:val="FF0000"/>
-          <w:sz w:val="26"/>
-          <w:szCs w:val="26"/>
-        </w:rPr>
-        <w:t xml:space="preserve">, </w:t>
-      </w:r>
-      <w:proofErr w:type="gramStart"/>
-      <w:r>
-        <w:rPr>
-          <w:rFonts w:cstheme="minorHAnsi"/>
-          <w:i/>
-          <w:color w:val="FF0000"/>
-          <w:sz w:val="26"/>
-          <w:szCs w:val="26"/>
-        </w:rPr>
-        <w:t>admin ????</w:t>
-      </w:r>
-      <w:proofErr w:type="gramEnd"/>
     </w:p>
     <w:p>
       <w:pPr>
@@ -7182,45 +3829,8 @@
         <w:pStyle w:val="Heading2"/>
       </w:pPr>
       <w:bookmarkStart w:id="9" w:name="_Toc41542394"/>
-      <w:proofErr w:type="spellStart"/>
       <w:r>
-        <w:t>Hạn</w:t>
-      </w:r>
-      <w:proofErr w:type="spellEnd"/>
-      <w:r>
-        <w:t xml:space="preserve"> </w:t>
-      </w:r>
-      <w:proofErr w:type="spellStart"/>
-      <w:r>
-        <w:t>chế</w:t>
-      </w:r>
-      <w:proofErr w:type="spellEnd"/>
-      <w:r>
-        <w:t xml:space="preserve"> </w:t>
-      </w:r>
-      <w:proofErr w:type="spellStart"/>
-      <w:r>
-        <w:t>của</w:t>
-      </w:r>
-      <w:proofErr w:type="spellEnd"/>
-      <w:r>
-        <w:t xml:space="preserve"> </w:t>
-      </w:r>
-      <w:proofErr w:type="spellStart"/>
-      <w:r>
-        <w:t>ứng</w:t>
-      </w:r>
-      <w:proofErr w:type="spellEnd"/>
-      <w:r>
-        <w:t xml:space="preserve"> </w:t>
-      </w:r>
-      <w:proofErr w:type="spellStart"/>
-      <w:r>
-        <w:t>dụng</w:t>
-      </w:r>
-      <w:proofErr w:type="spellEnd"/>
-      <w:r>
-        <w:t xml:space="preserve"> web</w:t>
+        <w:t>Hạn chế của ứng dụng web</w:t>
       </w:r>
       <w:bookmarkEnd w:id="9"/>
     </w:p>
@@ -7240,7 +3850,6 @@
           <w:szCs w:val="26"/>
         </w:rPr>
       </w:pPr>
-      <w:proofErr w:type="spellStart"/>
       <w:r>
         <w:rPr>
           <w:rFonts w:cstheme="minorHAnsi"/>
@@ -7249,163 +3858,8 @@
           <w:sz w:val="26"/>
           <w:szCs w:val="26"/>
         </w:rPr>
-        <w:t>Chỉ</w:t>
+        <w:t>Chỉ đang là web tĩnh, chưa có dữ liệu</w:t>
       </w:r>
-      <w:proofErr w:type="spellEnd"/>
-      <w:r>
-        <w:rPr>
-          <w:rFonts w:cstheme="minorHAnsi"/>
-          <w:i/>
-          <w:color w:val="FF0000"/>
-          <w:sz w:val="26"/>
-          <w:szCs w:val="26"/>
-        </w:rPr>
-        <w:t xml:space="preserve"> </w:t>
-      </w:r>
-      <w:proofErr w:type="spellStart"/>
-      <w:r>
-        <w:rPr>
-          <w:rFonts w:cstheme="minorHAnsi"/>
-          <w:i/>
-          <w:color w:val="FF0000"/>
-          <w:sz w:val="26"/>
-          <w:szCs w:val="26"/>
-        </w:rPr>
-        <w:t>đang</w:t>
-      </w:r>
-      <w:proofErr w:type="spellEnd"/>
-      <w:r>
-        <w:rPr>
-          <w:rFonts w:cstheme="minorHAnsi"/>
-          <w:i/>
-          <w:color w:val="FF0000"/>
-          <w:sz w:val="26"/>
-          <w:szCs w:val="26"/>
-        </w:rPr>
-        <w:t xml:space="preserve"> </w:t>
-      </w:r>
-      <w:proofErr w:type="spellStart"/>
-      <w:r>
-        <w:rPr>
-          <w:rFonts w:cstheme="minorHAnsi"/>
-          <w:i/>
-          <w:color w:val="FF0000"/>
-          <w:sz w:val="26"/>
-          <w:szCs w:val="26"/>
-        </w:rPr>
-        <w:t>là</w:t>
-      </w:r>
-      <w:proofErr w:type="spellEnd"/>
-      <w:r>
-        <w:rPr>
-          <w:rFonts w:cstheme="minorHAnsi"/>
-          <w:i/>
-          <w:color w:val="FF0000"/>
-          <w:sz w:val="26"/>
-          <w:szCs w:val="26"/>
-        </w:rPr>
-        <w:t xml:space="preserve"> web </w:t>
-      </w:r>
-      <w:proofErr w:type="spellStart"/>
-      <w:r>
-        <w:rPr>
-          <w:rFonts w:cstheme="minorHAnsi"/>
-          <w:i/>
-          <w:color w:val="FF0000"/>
-          <w:sz w:val="26"/>
-          <w:szCs w:val="26"/>
-        </w:rPr>
-        <w:t>tĩnh</w:t>
-      </w:r>
-      <w:proofErr w:type="spellEnd"/>
-      <w:r>
-        <w:rPr>
-          <w:rFonts w:cstheme="minorHAnsi"/>
-          <w:i/>
-          <w:color w:val="FF0000"/>
-          <w:sz w:val="26"/>
-          <w:szCs w:val="26"/>
-        </w:rPr>
-        <w:t xml:space="preserve">, </w:t>
-      </w:r>
-      <w:proofErr w:type="spellStart"/>
-      <w:r>
-        <w:rPr>
-          <w:rFonts w:cstheme="minorHAnsi"/>
-          <w:i/>
-          <w:color w:val="FF0000"/>
-          <w:sz w:val="26"/>
-          <w:szCs w:val="26"/>
-        </w:rPr>
-        <w:t>chưa</w:t>
-      </w:r>
-      <w:proofErr w:type="spellEnd"/>
-      <w:r>
-        <w:rPr>
-          <w:rFonts w:cstheme="minorHAnsi"/>
-          <w:i/>
-          <w:color w:val="FF0000"/>
-          <w:sz w:val="26"/>
-          <w:szCs w:val="26"/>
-        </w:rPr>
-        <w:t xml:space="preserve"> </w:t>
-      </w:r>
-      <w:proofErr w:type="spellStart"/>
-      <w:r>
-        <w:rPr>
-          <w:rFonts w:cstheme="minorHAnsi"/>
-          <w:i/>
-          <w:color w:val="FF0000"/>
-          <w:sz w:val="26"/>
-          <w:szCs w:val="26"/>
-        </w:rPr>
-        <w:t>có</w:t>
-      </w:r>
-      <w:proofErr w:type="spellEnd"/>
-      <w:r>
-        <w:rPr>
-          <w:rFonts w:cstheme="minorHAnsi"/>
-          <w:i/>
-          <w:color w:val="FF0000"/>
-          <w:sz w:val="26"/>
-          <w:szCs w:val="26"/>
-        </w:rPr>
-        <w:t xml:space="preserve"> </w:t>
-      </w:r>
-      <w:proofErr w:type="spellStart"/>
-      <w:r>
-        <w:rPr>
-          <w:rFonts w:cstheme="minorHAnsi"/>
-          <w:i/>
-          <w:color w:val="FF0000"/>
-          <w:sz w:val="26"/>
-          <w:szCs w:val="26"/>
-        </w:rPr>
-        <w:t>dữ</w:t>
-      </w:r>
-      <w:proofErr w:type="spellEnd"/>
-      <w:r>
-        <w:rPr>
-          <w:rFonts w:cstheme="minorHAnsi"/>
-          <w:i/>
-          <w:color w:val="FF0000"/>
-          <w:sz w:val="26"/>
-          <w:szCs w:val="26"/>
-        </w:rPr>
-        <w:t xml:space="preserve"> </w:t>
-      </w:r>
-      <w:proofErr w:type="spellStart"/>
-      <w:r>
-        <w:rPr>
-          <w:rFonts w:cstheme="minorHAnsi"/>
-          <w:i/>
-          <w:color w:val="FF0000"/>
-          <w:sz w:val="26"/>
-          <w:szCs w:val="26"/>
-        </w:rPr>
-        <w:t>liệu</w:t>
-      </w:r>
-      <w:proofErr w:type="spellEnd"/>
     </w:p>
     <w:p>
       <w:pPr>
@@ -7423,7 +3877,6 @@
           <w:szCs w:val="26"/>
         </w:rPr>
       </w:pPr>
-      <w:proofErr w:type="spellStart"/>
       <w:r>
         <w:rPr>
           <w:rFonts w:cstheme="minorHAnsi"/>
@@ -7432,185 +3885,8 @@
           <w:sz w:val="26"/>
           <w:szCs w:val="26"/>
         </w:rPr>
-        <w:t>Còn</w:t>
+        <w:t>Còn một số chức năng chưa hoàn thành được</w:t>
       </w:r>
-      <w:proofErr w:type="spellEnd"/>
-      <w:r>
-        <w:rPr>
-          <w:rFonts w:cstheme="minorHAnsi"/>
-          <w:i/>
-          <w:color w:val="FF0000"/>
-          <w:sz w:val="26"/>
-          <w:szCs w:val="26"/>
-        </w:rPr>
-        <w:t xml:space="preserve"> </w:t>
-      </w:r>
-      <w:proofErr w:type="spellStart"/>
-      <w:r>
-        <w:rPr>
-          <w:rFonts w:cstheme="minorHAnsi"/>
-          <w:i/>
-          <w:color w:val="FF0000"/>
-          <w:sz w:val="26"/>
-          <w:szCs w:val="26"/>
-        </w:rPr>
-        <w:t>một</w:t>
-      </w:r>
-      <w:proofErr w:type="spellEnd"/>
-      <w:r>
-        <w:rPr>
-          <w:rFonts w:cstheme="minorHAnsi"/>
-          <w:i/>
-          <w:color w:val="FF0000"/>
-          <w:sz w:val="26"/>
-          <w:szCs w:val="26"/>
-        </w:rPr>
-        <w:t xml:space="preserve"> </w:t>
-      </w:r>
-      <w:proofErr w:type="spellStart"/>
-      <w:r>
-        <w:rPr>
-          <w:rFonts w:cstheme="minorHAnsi"/>
-          <w:i/>
-          <w:color w:val="FF0000"/>
-          <w:sz w:val="26"/>
-          <w:szCs w:val="26"/>
-        </w:rPr>
-        <w:t>số</w:t>
-      </w:r>
-      <w:proofErr w:type="spellEnd"/>
-      <w:r>
-        <w:rPr>
-          <w:rFonts w:cstheme="minorHAnsi"/>
-          <w:i/>
-          <w:color w:val="FF0000"/>
-          <w:sz w:val="26"/>
-          <w:szCs w:val="26"/>
-        </w:rPr>
-        <w:t xml:space="preserve"> </w:t>
-      </w:r>
-      <w:proofErr w:type="spellStart"/>
-      <w:r>
-        <w:rPr>
-          <w:rFonts w:cstheme="minorHAnsi"/>
-          <w:i/>
-          <w:color w:val="FF0000"/>
-          <w:sz w:val="26"/>
-          <w:szCs w:val="26"/>
-        </w:rPr>
-        <w:t>chức</w:t>
-      </w:r>
-      <w:proofErr w:type="spellEnd"/>
-      <w:r>
-        <w:rPr>
-          <w:rFonts w:cstheme="minorHAnsi"/>
-          <w:i/>
-          <w:color w:val="FF0000"/>
-          <w:sz w:val="26"/>
-          <w:szCs w:val="26"/>
-        </w:rPr>
-        <w:t xml:space="preserve"> </w:t>
-      </w:r>
-      <w:proofErr w:type="spellStart"/>
-      <w:r>
-        <w:rPr>
-          <w:rFonts w:cstheme="minorHAnsi"/>
-          <w:i/>
-          <w:color w:val="FF0000"/>
-          <w:sz w:val="26"/>
-          <w:szCs w:val="26"/>
-        </w:rPr>
-        <w:t>năng</w:t>
-      </w:r>
-      <w:proofErr w:type="spellEnd"/>
-      <w:r>
-        <w:rPr>
-          <w:rFonts w:cstheme="minorHAnsi"/>
-          <w:i/>
-          <w:color w:val="FF0000"/>
-          <w:sz w:val="26"/>
-          <w:szCs w:val="26"/>
-        </w:rPr>
-        <w:t xml:space="preserve"> </w:t>
-      </w:r>
-      <w:proofErr w:type="spellStart"/>
-      <w:r>
-        <w:rPr>
-          <w:rFonts w:cstheme="minorHAnsi"/>
-          <w:i/>
-          <w:color w:val="FF0000"/>
-          <w:sz w:val="26"/>
-          <w:szCs w:val="26"/>
-        </w:rPr>
-        <w:t>chưa</w:t>
-      </w:r>
-      <w:proofErr w:type="spellEnd"/>
-      <w:r>
-        <w:rPr>
-          <w:rFonts w:cstheme="minorHAnsi"/>
-          <w:i/>
-          <w:color w:val="FF0000"/>
-          <w:sz w:val="26"/>
-          <w:szCs w:val="26"/>
-        </w:rPr>
-        <w:t xml:space="preserve"> </w:t>
-      </w:r>
-      <w:proofErr w:type="spellStart"/>
-      <w:r>
-        <w:rPr>
-          <w:rFonts w:cstheme="minorHAnsi"/>
-          <w:i/>
-          <w:color w:val="FF0000"/>
-          <w:sz w:val="26"/>
-          <w:szCs w:val="26"/>
-        </w:rPr>
-        <w:t>hoàn</w:t>
-      </w:r>
-      <w:proofErr w:type="spellEnd"/>
-      <w:r>
-        <w:rPr>
-          <w:rFonts w:cstheme="minorHAnsi"/>
-          <w:i/>
-          <w:color w:val="FF0000"/>
-          <w:sz w:val="26"/>
-          <w:szCs w:val="26"/>
-        </w:rPr>
-        <w:t xml:space="preserve"> </w:t>
-      </w:r>
-      <w:proofErr w:type="spellStart"/>
-      <w:r>
-        <w:rPr>
-          <w:rFonts w:cstheme="minorHAnsi"/>
-          <w:i/>
-          <w:color w:val="FF0000"/>
-          <w:sz w:val="26"/>
-          <w:szCs w:val="26"/>
-        </w:rPr>
-        <w:t>thành</w:t>
-      </w:r>
-      <w:proofErr w:type="spellEnd"/>
-      <w:r>
-        <w:rPr>
-          <w:rFonts w:cstheme="minorHAnsi"/>
-          <w:i/>
-          <w:color w:val="FF0000"/>
-          <w:sz w:val="26"/>
-          <w:szCs w:val="26"/>
-        </w:rPr>
-        <w:t xml:space="preserve"> </w:t>
-      </w:r>
-      <w:proofErr w:type="spellStart"/>
-      <w:r>
-        <w:rPr>
-          <w:rFonts w:cstheme="minorHAnsi"/>
-          <w:i/>
-          <w:color w:val="FF0000"/>
-          <w:sz w:val="26"/>
-          <w:szCs w:val="26"/>
-        </w:rPr>
-        <w:t>được</w:t>
-      </w:r>
-      <w:proofErr w:type="spellEnd"/>
     </w:p>
     <w:p>
       <w:pPr>
@@ -7671,28 +3947,10 @@
         <w:pStyle w:val="Heading2"/>
       </w:pPr>
       <w:bookmarkStart w:id="10" w:name="_Toc41542395"/>
-      <w:proofErr w:type="spellStart"/>
       <w:r>
-        <w:t>Hướng</w:t>
-      </w:r>
-      <w:proofErr w:type="spellEnd"/>
-      <w:r>
-        <w:t xml:space="preserve"> </w:t>
-      </w:r>
-      <w:proofErr w:type="spellStart"/>
-      <w:r>
-        <w:t>phát</w:t>
-      </w:r>
-      <w:proofErr w:type="spellEnd"/>
-      <w:r>
-        <w:t xml:space="preserve"> </w:t>
-      </w:r>
-      <w:proofErr w:type="spellStart"/>
-      <w:r>
-        <w:t>triển</w:t>
+        <w:t>Hướng phát triển</w:t>
       </w:r>
       <w:bookmarkEnd w:id="10"/>
-      <w:proofErr w:type="spellEnd"/>
     </w:p>
     <w:p>
       <w:pPr>
@@ -7759,22 +4017,9 @@
       </w:pPr>
       <w:bookmarkStart w:id="12" w:name="_Toc41542397"/>
       <w:r>
-        <w:t xml:space="preserve">Giáo </w:t>
-      </w:r>
-      <w:proofErr w:type="spellStart"/>
-      <w:r>
-        <w:t>trình</w:t>
-      </w:r>
-      <w:proofErr w:type="spellEnd"/>
-      <w:r>
-        <w:t xml:space="preserve"> - </w:t>
-      </w:r>
-      <w:proofErr w:type="spellStart"/>
-      <w:r>
-        <w:t>Sách</w:t>
+        <w:t>Giáo trình - Sách</w:t>
       </w:r>
       <w:bookmarkEnd w:id="12"/>
-      <w:proofErr w:type="spellEnd"/>
     </w:p>
     <w:p>
       <w:pPr>
@@ -7794,286 +4039,8 @@
           <w:sz w:val="26"/>
           <w:szCs w:val="26"/>
         </w:rPr>
-        <w:t>[1</w:t>
+        <w:t>[1]  Tên tài liệu  - Tên Tác Giả - Năm Xuất Bản – Nhà xuất bản</w:t>
       </w:r>
-      <w:proofErr w:type="gramStart"/>
-      <w:r>
-        <w:rPr>
-          <w:rFonts w:cstheme="minorHAnsi"/>
-          <w:i/>
-          <w:color w:val="FF0000"/>
-          <w:sz w:val="26"/>
-          <w:szCs w:val="26"/>
-        </w:rPr>
-        <w:t xml:space="preserve">]  </w:t>
-      </w:r>
-      <w:proofErr w:type="spellStart"/>
-      <w:r>
-        <w:rPr>
-          <w:rFonts w:cstheme="minorHAnsi"/>
-          <w:i/>
-          <w:color w:val="FF0000"/>
-          <w:sz w:val="26"/>
-          <w:szCs w:val="26"/>
-        </w:rPr>
-        <w:t>Tên</w:t>
-      </w:r>
-      <w:proofErr w:type="spellEnd"/>
-      <w:proofErr w:type="gramEnd"/>
-      <w:r>
-        <w:rPr>
-          <w:rFonts w:cstheme="minorHAnsi"/>
-          <w:i/>
-          <w:color w:val="FF0000"/>
-          <w:sz w:val="26"/>
-          <w:szCs w:val="26"/>
-        </w:rPr>
-        <w:t xml:space="preserve"> </w:t>
-      </w:r>
-      <w:proofErr w:type="spellStart"/>
-      <w:r>
-        <w:rPr>
-          <w:rFonts w:cstheme="minorHAnsi"/>
-          <w:i/>
-          <w:color w:val="FF0000"/>
-          <w:sz w:val="26"/>
-          <w:szCs w:val="26"/>
-        </w:rPr>
-        <w:t>tài</w:t>
-      </w:r>
-      <w:proofErr w:type="spellEnd"/>
-      <w:r>
-        <w:rPr>
-          <w:rFonts w:cstheme="minorHAnsi"/>
-          <w:i/>
-          <w:color w:val="FF0000"/>
-          <w:sz w:val="26"/>
-          <w:szCs w:val="26"/>
-        </w:rPr>
-        <w:t xml:space="preserve"> </w:t>
-      </w:r>
-      <w:proofErr w:type="spellStart"/>
-      <w:proofErr w:type="gramStart"/>
-      <w:r>
-        <w:rPr>
-          <w:rFonts w:cstheme="minorHAnsi"/>
-          <w:i/>
-          <w:color w:val="FF0000"/>
-          <w:sz w:val="26"/>
-          <w:szCs w:val="26"/>
-        </w:rPr>
-        <w:t>liệu</w:t>
-      </w:r>
-      <w:proofErr w:type="spellEnd"/>
-      <w:r>
-        <w:rPr>
-          <w:rFonts w:cstheme="minorHAnsi"/>
-          <w:i/>
-          <w:color w:val="FF0000"/>
-          <w:sz w:val="26"/>
-          <w:szCs w:val="26"/>
-        </w:rPr>
-        <w:t xml:space="preserve">  -</w:t>
-      </w:r>
-      <w:proofErr w:type="gramEnd"/>
-      <w:r>
-        <w:rPr>
-          <w:rFonts w:cstheme="minorHAnsi"/>
-          <w:i/>
-          <w:color w:val="FF0000"/>
-          <w:sz w:val="26"/>
-          <w:szCs w:val="26"/>
-        </w:rPr>
-        <w:t xml:space="preserve"> </w:t>
-      </w:r>
-      <w:proofErr w:type="spellStart"/>
-      <w:r>
-        <w:rPr>
-          <w:rFonts w:cstheme="minorHAnsi"/>
-          <w:i/>
-          <w:color w:val="FF0000"/>
-          <w:sz w:val="26"/>
-          <w:szCs w:val="26"/>
-        </w:rPr>
-        <w:t>Tên</w:t>
-      </w:r>
-      <w:proofErr w:type="spellEnd"/>
-      <w:r>
-        <w:rPr>
-          <w:rFonts w:cstheme="minorHAnsi"/>
-          <w:i/>
-          <w:color w:val="FF0000"/>
-          <w:sz w:val="26"/>
-          <w:szCs w:val="26"/>
-        </w:rPr>
-        <w:t xml:space="preserve"> </w:t>
-      </w:r>
-      <w:proofErr w:type="spellStart"/>
-      <w:r>
-        <w:rPr>
-          <w:rFonts w:cstheme="minorHAnsi"/>
-          <w:i/>
-          <w:color w:val="FF0000"/>
-          <w:sz w:val="26"/>
-          <w:szCs w:val="26"/>
-        </w:rPr>
-        <w:t>Tác</w:t>
-      </w:r>
-      <w:proofErr w:type="spellEnd"/>
-      <w:r>
-        <w:rPr>
-          <w:rFonts w:cstheme="minorHAnsi"/>
-          <w:i/>
-          <w:color w:val="FF0000"/>
-          <w:sz w:val="26"/>
-          <w:szCs w:val="26"/>
-        </w:rPr>
-        <w:t xml:space="preserve"> </w:t>
-      </w:r>
-      <w:proofErr w:type="spellStart"/>
-      <w:r>
-        <w:rPr>
-          <w:rFonts w:cstheme="minorHAnsi"/>
-          <w:i/>
-          <w:color w:val="FF0000"/>
-          <w:sz w:val="26"/>
-          <w:szCs w:val="26"/>
-        </w:rPr>
-        <w:t>Giả</w:t>
-      </w:r>
-      <w:proofErr w:type="spellEnd"/>
-      <w:r>
-        <w:rPr>
-          <w:rFonts w:cstheme="minorHAnsi"/>
-          <w:i/>
-          <w:color w:val="FF0000"/>
-          <w:sz w:val="26"/>
-          <w:szCs w:val="26"/>
-        </w:rPr>
-        <w:t xml:space="preserve"> - </w:t>
-      </w:r>
-      <w:proofErr w:type="spellStart"/>
-      <w:r>
-        <w:rPr>
-          <w:rFonts w:cstheme="minorHAnsi"/>
-          <w:i/>
-          <w:color w:val="FF0000"/>
-          <w:sz w:val="26"/>
-          <w:szCs w:val="26"/>
-        </w:rPr>
-        <w:t>Năm</w:t>
-      </w:r>
-      <w:proofErr w:type="spellEnd"/>
-      <w:r>
-        <w:rPr>
-          <w:rFonts w:cstheme="minorHAnsi"/>
-          <w:i/>
-          <w:color w:val="FF0000"/>
-          <w:sz w:val="26"/>
-          <w:szCs w:val="26"/>
-        </w:rPr>
-        <w:t xml:space="preserve"> </w:t>
-      </w:r>
-      <w:proofErr w:type="spellStart"/>
-      <w:r>
-        <w:rPr>
-          <w:rFonts w:cstheme="minorHAnsi"/>
-          <w:i/>
-          <w:color w:val="FF0000"/>
-          <w:sz w:val="26"/>
-          <w:szCs w:val="26"/>
-        </w:rPr>
-        <w:t>Xuất</w:t>
-      </w:r>
-      <w:proofErr w:type="spellEnd"/>
-      <w:r>
-        <w:rPr>
-          <w:rFonts w:cstheme="minorHAnsi"/>
-          <w:i/>
-          <w:color w:val="FF0000"/>
-          <w:sz w:val="26"/>
-          <w:szCs w:val="26"/>
-        </w:rPr>
-        <w:t xml:space="preserve"> </w:t>
-      </w:r>
-      <w:proofErr w:type="spellStart"/>
-      <w:r>
-        <w:rPr>
-          <w:rFonts w:cstheme="minorHAnsi"/>
-          <w:i/>
-          <w:color w:val="FF0000"/>
-          <w:sz w:val="26"/>
-          <w:szCs w:val="26"/>
-        </w:rPr>
-        <w:t>Bản</w:t>
-      </w:r>
-      <w:proofErr w:type="spellEnd"/>
-      <w:r>
-        <w:rPr>
-          <w:rFonts w:cstheme="minorHAnsi"/>
-          <w:i/>
-          <w:color w:val="FF0000"/>
-          <w:sz w:val="26"/>
-          <w:szCs w:val="26"/>
-        </w:rPr>
-        <w:t xml:space="preserve"> – </w:t>
-      </w:r>
-      <w:proofErr w:type="spellStart"/>
-      <w:r>
-        <w:rPr>
-          <w:rFonts w:cstheme="minorHAnsi"/>
-          <w:i/>
-          <w:color w:val="FF0000"/>
-          <w:sz w:val="26"/>
-          <w:szCs w:val="26"/>
-        </w:rPr>
-        <w:t>Nhà</w:t>
-      </w:r>
-      <w:proofErr w:type="spellEnd"/>
-      <w:r>
-        <w:rPr>
-          <w:rFonts w:cstheme="minorHAnsi"/>
-          <w:i/>
-          <w:color w:val="FF0000"/>
-          <w:sz w:val="26"/>
-          <w:szCs w:val="26"/>
-        </w:rPr>
-        <w:t xml:space="preserve"> </w:t>
-      </w:r>
-      <w:proofErr w:type="spellStart"/>
-      <w:r>
-        <w:rPr>
-          <w:rFonts w:cstheme="minorHAnsi"/>
-          <w:i/>
-          <w:color w:val="FF0000"/>
-          <w:sz w:val="26"/>
-          <w:szCs w:val="26"/>
-        </w:rPr>
-        <w:t>xuất</w:t>
-      </w:r>
-      <w:proofErr w:type="spellEnd"/>
-      <w:r>
-        <w:rPr>
-          <w:rFonts w:cstheme="minorHAnsi"/>
-          <w:i/>
-          <w:color w:val="FF0000"/>
-          <w:sz w:val="26"/>
-          <w:szCs w:val="26"/>
-        </w:rPr>
-        <w:t xml:space="preserve"> </w:t>
-      </w:r>
-      <w:proofErr w:type="spellStart"/>
-      <w:r>
-        <w:rPr>
-          <w:rFonts w:cstheme="minorHAnsi"/>
-          <w:i/>
-          <w:color w:val="FF0000"/>
-          <w:sz w:val="26"/>
-          <w:szCs w:val="26"/>
-        </w:rPr>
-        <w:t>bản</w:t>
-      </w:r>
-      <w:proofErr w:type="spellEnd"/>
     </w:p>
     <w:p>
       <w:pPr>
@@ -8138,7 +4105,6 @@
                 <w:szCs w:val="26"/>
               </w:rPr>
             </w:pPr>
-            <w:proofErr w:type="spellStart"/>
             <w:r>
               <w:rPr>
                 <w:rFonts w:cstheme="minorHAnsi"/>
@@ -8147,9 +4113,8 @@
                 <w:sz w:val="26"/>
                 <w:szCs w:val="26"/>
               </w:rPr>
-              <w:t>Tên</w:t>
-            </w:r>
-            <w:proofErr w:type="spellEnd"/>
+              <w:t xml:space="preserve">Tên </w:t>
+            </w:r>
             <w:r>
               <w:rPr>
                 <w:rFonts w:cstheme="minorHAnsi"/>
@@ -8158,7 +4123,7 @@
                 <w:sz w:val="26"/>
                 <w:szCs w:val="26"/>
               </w:rPr>
-              <w:t xml:space="preserve"> </w:t>
+              <w:t>website</w:t>
             </w:r>
             <w:r>
               <w:rPr>
@@ -8168,52 +4133,8 @@
                 <w:sz w:val="26"/>
                 <w:szCs w:val="26"/>
               </w:rPr>
-              <w:t>website</w:t>
-            </w:r>
-            <w:r>
-              <w:rPr>
-                <w:rFonts w:cstheme="minorHAnsi"/>
-                <w:i/>
-                <w:color w:val="FF0000"/>
-                <w:sz w:val="26"/>
-                <w:szCs w:val="26"/>
-              </w:rPr>
-              <w:t xml:space="preserve"> </w:t>
-            </w:r>
-            <w:proofErr w:type="spellStart"/>
-            <w:r>
-              <w:rPr>
-                <w:rFonts w:cstheme="minorHAnsi"/>
-                <w:i/>
-                <w:color w:val="FF0000"/>
-                <w:sz w:val="26"/>
-                <w:szCs w:val="26"/>
-              </w:rPr>
-              <w:t>tham</w:t>
-            </w:r>
-            <w:proofErr w:type="spellEnd"/>
-            <w:r>
-              <w:rPr>
-                <w:rFonts w:cstheme="minorHAnsi"/>
-                <w:i/>
-                <w:color w:val="FF0000"/>
-                <w:sz w:val="26"/>
-                <w:szCs w:val="26"/>
-              </w:rPr>
-              <w:t xml:space="preserve"> </w:t>
-            </w:r>
-            <w:proofErr w:type="spellStart"/>
-            <w:r>
-              <w:rPr>
-                <w:rFonts w:cstheme="minorHAnsi"/>
-                <w:i/>
-                <w:color w:val="FF0000"/>
-                <w:sz w:val="26"/>
-                <w:szCs w:val="26"/>
-              </w:rPr>
-              <w:t>khảo</w:t>
-            </w:r>
-            <w:proofErr w:type="spellEnd"/>
+              <w:t xml:space="preserve"> tham khảo</w:t>
+            </w:r>
           </w:p>
         </w:tc>
         <w:tc>
@@ -8231,7 +4152,6 @@
                 <w:szCs w:val="26"/>
               </w:rPr>
             </w:pPr>
-            <w:proofErr w:type="spellStart"/>
             <w:r>
               <w:rPr>
                 <w:rFonts w:cstheme="minorHAnsi"/>
@@ -8242,7 +4162,6 @@
               </w:rPr>
               <w:t>Nguồn</w:t>
             </w:r>
-            <w:proofErr w:type="spellEnd"/>
           </w:p>
         </w:tc>
       </w:tr>
@@ -8290,7 +4209,7 @@
                 <w:szCs w:val="26"/>
               </w:rPr>
             </w:pPr>
-            <w:hyperlink r:id="rId15" w:history="1">
+            <w:hyperlink r:id="rId11" w:history="1">
               <w:r>
                 <w:rPr>
                   <w:rStyle w:val="Hyperlink"/>
@@ -8369,7 +4288,7 @@
                 <w:szCs w:val="26"/>
               </w:rPr>
             </w:pPr>
-            <w:hyperlink r:id="rId16" w:history="1">
+            <w:hyperlink r:id="rId12" w:history="1">
               <w:r>
                 <w:rPr>
                   <w:rStyle w:val="Hyperlink"/>
@@ -8438,7 +4357,7 @@
                 <w:szCs w:val="26"/>
               </w:rPr>
             </w:pPr>
-            <w:hyperlink r:id="rId17" w:history="1">
+            <w:hyperlink r:id="rId13" w:history="1">
               <w:r>
                 <w:rPr>
                   <w:rStyle w:val="Hyperlink"/>
@@ -14722,6 +10641,7 @@
   <w:style w:type="character" w:default="1" w:styleId="DefaultParagraphFont">
     <w:name w:val="Default Paragraph Font"/>
     <w:uiPriority w:val="1"/>
+    <w:semiHidden/>
     <w:unhideWhenUsed/>
   </w:style>
   <w:style w:type="table" w:default="1" w:styleId="TableNormal">
@@ -15333,7 +11253,6 @@
     <w:sig w:usb0="E0002EFF" w:usb1="C000785B" w:usb2="00000009" w:usb3="00000000" w:csb0="000001FF" w:csb1="00000000"/>
   </w:font>
   <w:font w:name="MS Mincho">
-    <w:altName w:val="ＭＳ 明朝"/>
     <w:panose1 w:val="02020609040205080304"/>
     <w:charset w:val="80"/>
     <w:family w:val="modern"/>
@@ -15362,7 +11281,6 @@
     <w:sig w:usb0="20000287" w:usb1="00000003" w:usb2="00000000" w:usb3="00000000" w:csb0="0000019F" w:csb1="00000000"/>
   </w:font>
   <w:font w:name="Yu Mincho">
-    <w:altName w:val="游明朝"/>
     <w:charset w:val="80"/>
     <w:family w:val="roman"/>
     <w:pitch w:val="variable"/>
@@ -15403,6 +11321,7 @@
     <w:rsidRoot w:val="00F152FF"/>
     <w:rsid w:val="000038E4"/>
     <w:rsid w:val="000862D2"/>
+    <w:rsid w:val="00091B47"/>
     <w:rsid w:val="000A4C69"/>
     <w:rsid w:val="00105AA6"/>
     <w:rsid w:val="00116DAC"/>
@@ -15434,6 +11353,7 @@
     <w:rsid w:val="00416DE4"/>
     <w:rsid w:val="004935C8"/>
     <w:rsid w:val="00496674"/>
+    <w:rsid w:val="004B2077"/>
     <w:rsid w:val="004B7C8E"/>
     <w:rsid w:val="004F22F4"/>
     <w:rsid w:val="00530575"/>

</xml_diff>